<commit_message>
chore: clean up empty code change sections in the changes log
</commit_message>
<xml_diff>
--- a/ScanWell_CRM_AI_Integration_Timeline.docx
+++ b/ScanWell_CRM_AI_Integration_Timeline.docx
@@ -62,21 +62,25 @@
             </w:tcBorders>
             <w:shd w:fill="D6E4F0" w:val="clear"/>
             <w:tcMar>
-              <w:top w:type="dxa" w:w="80"/>
-              <w:left w:type="dxa" w:w="120"/>
-              <w:bottom w:type="dxa" w:w="80"/>
-              <w:right w:type="dxa" w:w="120"/>
-            </w:tcMar>
-          </w:tcPr>
-          <w:p>
+              <w:top w:type="dxa" w:w="90"/>
+              <w:left w:type="dxa" w:w="130"/>
+              <w:bottom w:type="dxa" w:w="90"/>
+              <w:right w:type="dxa" w:w="130"/>
+            </w:tcMar>
+            <w:vAlign w:val="center"/>
+          </w:tcPr>
+          <w:p>
+            <w:pPr>
+              <w:jc w:val="left"/>
+            </w:pPr>
             <w:r>
               <w:rPr>
                 <w:rFonts w:ascii="Calibri" w:cs="Calibri" w:eastAsia="Calibri" w:hAnsi="Calibri"/>
                 <w:b/>
                 <w:bCs/>
                 <w:color w:val="1F4E79"/>
-                <w:sz w:val="18"/>
-                <w:szCs w:val="18"/>
+                <w:sz w:val="19"/>
+                <w:szCs w:val="19"/>
               </w:rPr>
               <w:t xml:space="preserve">Version</w:t>
             </w:r>
@@ -93,21 +97,27 @@
             </w:tcBorders>
             <w:shd w:fill="FFFFFF" w:val="clear"/>
             <w:tcMar>
-              <w:top w:type="dxa" w:w="80"/>
-              <w:left w:type="dxa" w:w="120"/>
-              <w:bottom w:type="dxa" w:w="80"/>
-              <w:right w:type="dxa" w:w="120"/>
-            </w:tcMar>
-          </w:tcPr>
-          <w:p>
-            <w:r>
-              <w:rPr>
-                <w:rFonts w:ascii="Calibri" w:cs="Calibri" w:eastAsia="Calibri" w:hAnsi="Calibri"/>
-                <w:color w:val="1A1A2E"/>
-                <w:sz w:val="18"/>
-                <w:szCs w:val="18"/>
-              </w:rPr>
-              <w:t xml:space="preserve">1.0</w:t>
+              <w:top w:type="dxa" w:w="90"/>
+              <w:left w:type="dxa" w:w="130"/>
+              <w:bottom w:type="dxa" w:w="90"/>
+              <w:right w:type="dxa" w:w="130"/>
+            </w:tcMar>
+            <w:vAlign w:val="center"/>
+          </w:tcPr>
+          <w:p>
+            <w:pPr>
+              <w:jc w:val="left"/>
+            </w:pPr>
+            <w:r>
+              <w:rPr>
+                <w:rFonts w:ascii="Calibri" w:cs="Calibri" w:eastAsia="Calibri" w:hAnsi="Calibri"/>
+                <w:b w:val="false"/>
+                <w:bCs w:val="false"/>
+                <w:color w:val="1A1A2E"/>
+                <w:sz w:val="19"/>
+                <w:szCs w:val="19"/>
+              </w:rPr>
+              <w:t xml:space="preserve">2.0 (Agreed Scope)</w:t>
             </w:r>
           </w:p>
         </w:tc>
@@ -122,21 +132,25 @@
             </w:tcBorders>
             <w:shd w:fill="D6E4F0" w:val="clear"/>
             <w:tcMar>
-              <w:top w:type="dxa" w:w="80"/>
-              <w:left w:type="dxa" w:w="120"/>
-              <w:bottom w:type="dxa" w:w="80"/>
-              <w:right w:type="dxa" w:w="120"/>
-            </w:tcMar>
-          </w:tcPr>
-          <w:p>
+              <w:top w:type="dxa" w:w="90"/>
+              <w:left w:type="dxa" w:w="130"/>
+              <w:bottom w:type="dxa" w:w="90"/>
+              <w:right w:type="dxa" w:w="130"/>
+            </w:tcMar>
+            <w:vAlign w:val="center"/>
+          </w:tcPr>
+          <w:p>
+            <w:pPr>
+              <w:jc w:val="left"/>
+            </w:pPr>
             <w:r>
               <w:rPr>
                 <w:rFonts w:ascii="Calibri" w:cs="Calibri" w:eastAsia="Calibri" w:hAnsi="Calibri"/>
                 <w:b/>
                 <w:bCs/>
                 <w:color w:val="1F4E79"/>
-                <w:sz w:val="18"/>
-                <w:szCs w:val="18"/>
+                <w:sz w:val="19"/>
+                <w:szCs w:val="19"/>
               </w:rPr>
               <w:t xml:space="preserve">Date</w:t>
             </w:r>
@@ -153,21 +167,27 @@
             </w:tcBorders>
             <w:shd w:fill="FFFFFF" w:val="clear"/>
             <w:tcMar>
-              <w:top w:type="dxa" w:w="80"/>
-              <w:left w:type="dxa" w:w="120"/>
-              <w:bottom w:type="dxa" w:w="80"/>
-              <w:right w:type="dxa" w:w="120"/>
-            </w:tcMar>
-          </w:tcPr>
-          <w:p>
-            <w:r>
-              <w:rPr>
-                <w:rFonts w:ascii="Calibri" w:cs="Calibri" w:eastAsia="Calibri" w:hAnsi="Calibri"/>
-                <w:color w:val="1A1A2E"/>
-                <w:sz w:val="18"/>
-                <w:szCs w:val="18"/>
-              </w:rPr>
-              <w:t xml:space="preserve">April 2, 2026</w:t>
+              <w:top w:type="dxa" w:w="90"/>
+              <w:left w:type="dxa" w:w="130"/>
+              <w:bottom w:type="dxa" w:w="90"/>
+              <w:right w:type="dxa" w:w="130"/>
+            </w:tcMar>
+            <w:vAlign w:val="center"/>
+          </w:tcPr>
+          <w:p>
+            <w:pPr>
+              <w:jc w:val="left"/>
+            </w:pPr>
+            <w:r>
+              <w:rPr>
+                <w:rFonts w:ascii="Calibri" w:cs="Calibri" w:eastAsia="Calibri" w:hAnsi="Calibri"/>
+                <w:b w:val="false"/>
+                <w:bCs w:val="false"/>
+                <w:color w:val="1A1A2E"/>
+                <w:sz w:val="19"/>
+                <w:szCs w:val="19"/>
+              </w:rPr>
+              <w:t xml:space="preserve">April 23, 2026</w:t>
             </w:r>
           </w:p>
         </w:tc>
@@ -184,21 +204,25 @@
             </w:tcBorders>
             <w:shd w:fill="D6E4F0" w:val="clear"/>
             <w:tcMar>
-              <w:top w:type="dxa" w:w="80"/>
-              <w:left w:type="dxa" w:w="120"/>
-              <w:bottom w:type="dxa" w:w="80"/>
-              <w:right w:type="dxa" w:w="120"/>
-            </w:tcMar>
-          </w:tcPr>
-          <w:p>
+              <w:top w:type="dxa" w:w="90"/>
+              <w:left w:type="dxa" w:w="130"/>
+              <w:bottom w:type="dxa" w:w="90"/>
+              <w:right w:type="dxa" w:w="130"/>
+            </w:tcMar>
+            <w:vAlign w:val="center"/>
+          </w:tcPr>
+          <w:p>
+            <w:pPr>
+              <w:jc w:val="left"/>
+            </w:pPr>
             <w:r>
               <w:rPr>
                 <w:rFonts w:ascii="Calibri" w:cs="Calibri" w:eastAsia="Calibri" w:hAnsi="Calibri"/>
                 <w:b/>
                 <w:bCs/>
                 <w:color w:val="1F4E79"/>
-                <w:sz w:val="18"/>
-                <w:szCs w:val="18"/>
+                <w:sz w:val="19"/>
+                <w:szCs w:val="19"/>
               </w:rPr>
               <w:t xml:space="preserve">Project Start</w:t>
             </w:r>
@@ -215,21 +239,27 @@
             </w:tcBorders>
             <w:shd w:fill="FFFFFF" w:val="clear"/>
             <w:tcMar>
-              <w:top w:type="dxa" w:w="80"/>
-              <w:left w:type="dxa" w:w="120"/>
-              <w:bottom w:type="dxa" w:w="80"/>
-              <w:right w:type="dxa" w:w="120"/>
-            </w:tcMar>
-          </w:tcPr>
-          <w:p>
-            <w:r>
-              <w:rPr>
-                <w:rFonts w:ascii="Calibri" w:cs="Calibri" w:eastAsia="Calibri" w:hAnsi="Calibri"/>
-                <w:color w:val="1A1A2E"/>
-                <w:sz w:val="18"/>
-                <w:szCs w:val="18"/>
-              </w:rPr>
-              <w:t xml:space="preserve">April 14, 2026</w:t>
+              <w:top w:type="dxa" w:w="90"/>
+              <w:left w:type="dxa" w:w="130"/>
+              <w:bottom w:type="dxa" w:w="90"/>
+              <w:right w:type="dxa" w:w="130"/>
+            </w:tcMar>
+            <w:vAlign w:val="center"/>
+          </w:tcPr>
+          <w:p>
+            <w:pPr>
+              <w:jc w:val="left"/>
+            </w:pPr>
+            <w:r>
+              <w:rPr>
+                <w:rFonts w:ascii="Calibri" w:cs="Calibri" w:eastAsia="Calibri" w:hAnsi="Calibri"/>
+                <w:b w:val="false"/>
+                <w:bCs w:val="false"/>
+                <w:color w:val="1A1A2E"/>
+                <w:sz w:val="19"/>
+                <w:szCs w:val="19"/>
+              </w:rPr>
+              <w:t xml:space="preserve">May 4, 2026</w:t>
             </w:r>
           </w:p>
         </w:tc>
@@ -244,21 +274,25 @@
             </w:tcBorders>
             <w:shd w:fill="D6E4F0" w:val="clear"/>
             <w:tcMar>
-              <w:top w:type="dxa" w:w="80"/>
-              <w:left w:type="dxa" w:w="120"/>
-              <w:bottom w:type="dxa" w:w="80"/>
-              <w:right w:type="dxa" w:w="120"/>
-            </w:tcMar>
-          </w:tcPr>
-          <w:p>
+              <w:top w:type="dxa" w:w="90"/>
+              <w:left w:type="dxa" w:w="130"/>
+              <w:bottom w:type="dxa" w:w="90"/>
+              <w:right w:type="dxa" w:w="130"/>
+            </w:tcMar>
+            <w:vAlign w:val="center"/>
+          </w:tcPr>
+          <w:p>
+            <w:pPr>
+              <w:jc w:val="left"/>
+            </w:pPr>
             <w:r>
               <w:rPr>
                 <w:rFonts w:ascii="Calibri" w:cs="Calibri" w:eastAsia="Calibri" w:hAnsi="Calibri"/>
                 <w:b/>
                 <w:bCs/>
                 <w:color w:val="1F4E79"/>
-                <w:sz w:val="18"/>
-                <w:szCs w:val="18"/>
+                <w:sz w:val="19"/>
+                <w:szCs w:val="19"/>
               </w:rPr>
               <w:t xml:space="preserve">Target Completion</w:t>
             </w:r>
@@ -275,54 +309,62 @@
             </w:tcBorders>
             <w:shd w:fill="FFFFFF" w:val="clear"/>
             <w:tcMar>
-              <w:top w:type="dxa" w:w="80"/>
-              <w:left w:type="dxa" w:w="120"/>
-              <w:bottom w:type="dxa" w:w="80"/>
-              <w:right w:type="dxa" w:w="120"/>
-            </w:tcMar>
-          </w:tcPr>
-          <w:p>
-            <w:r>
-              <w:rPr>
-                <w:rFonts w:ascii="Calibri" w:cs="Calibri" w:eastAsia="Calibri" w:hAnsi="Calibri"/>
-                <w:b/>
-                <w:bCs/>
-                <w:color w:val="2E75B6"/>
-                <w:sz w:val="18"/>
-                <w:szCs w:val="18"/>
-              </w:rPr>
-              <w:t xml:space="preserve">September 5, 2026</w:t>
-            </w:r>
-          </w:p>
-        </w:tc>
-      </w:tr>
-      <w:tr>
-        <w:tc>
-          <w:tcPr>
-            <w:tcW w:type="dxa" w:w="2400"/>
-            <w:tcBorders>
-              <w:top w:val="single" w:color="CCCCCC" w:sz="1"/>
-              <w:left w:val="single" w:color="CCCCCC" w:sz="1"/>
-              <w:bottom w:val="single" w:color="CCCCCC" w:sz="1"/>
-              <w:right w:val="single" w:color="CCCCCC" w:sz="1"/>
-            </w:tcBorders>
-            <w:shd w:fill="D6E4F0" w:val="clear"/>
-            <w:tcMar>
-              <w:top w:type="dxa" w:w="80"/>
-              <w:left w:type="dxa" w:w="120"/>
-              <w:bottom w:type="dxa" w:w="80"/>
-              <w:right w:type="dxa" w:w="120"/>
-            </w:tcMar>
-          </w:tcPr>
-          <w:p>
+              <w:top w:type="dxa" w:w="90"/>
+              <w:left w:type="dxa" w:w="130"/>
+              <w:bottom w:type="dxa" w:w="90"/>
+              <w:right w:type="dxa" w:w="130"/>
+            </w:tcMar>
+            <w:vAlign w:val="center"/>
+          </w:tcPr>
+          <w:p>
+            <w:pPr>
+              <w:jc w:val="left"/>
+            </w:pPr>
             <w:r>
               <w:rPr>
                 <w:rFonts w:ascii="Calibri" w:cs="Calibri" w:eastAsia="Calibri" w:hAnsi="Calibri"/>
                 <w:b/>
                 <w:bCs/>
                 <w:color w:val="1F4E79"/>
-                <w:sz w:val="18"/>
-                <w:szCs w:val="18"/>
+                <w:sz w:val="19"/>
+                <w:szCs w:val="19"/>
+              </w:rPr>
+              <w:t xml:space="preserve">September 18, 2026</w:t>
+            </w:r>
+          </w:p>
+        </w:tc>
+      </w:tr>
+      <w:tr>
+        <w:tc>
+          <w:tcPr>
+            <w:tcW w:type="dxa" w:w="2400"/>
+            <w:tcBorders>
+              <w:top w:val="single" w:color="CCCCCC" w:sz="1"/>
+              <w:left w:val="single" w:color="CCCCCC" w:sz="1"/>
+              <w:bottom w:val="single" w:color="CCCCCC" w:sz="1"/>
+              <w:right w:val="single" w:color="CCCCCC" w:sz="1"/>
+            </w:tcBorders>
+            <w:shd w:fill="D6E4F0" w:val="clear"/>
+            <w:tcMar>
+              <w:top w:type="dxa" w:w="90"/>
+              <w:left w:type="dxa" w:w="130"/>
+              <w:bottom w:type="dxa" w:w="90"/>
+              <w:right w:type="dxa" w:w="130"/>
+            </w:tcMar>
+            <w:vAlign w:val="center"/>
+          </w:tcPr>
+          <w:p>
+            <w:pPr>
+              <w:jc w:val="left"/>
+            </w:pPr>
+            <w:r>
+              <w:rPr>
+                <w:rFonts w:ascii="Calibri" w:cs="Calibri" w:eastAsia="Calibri" w:hAnsi="Calibri"/>
+                <w:b/>
+                <w:bCs/>
+                <w:color w:val="1F4E79"/>
+                <w:sz w:val="19"/>
+                <w:szCs w:val="19"/>
               </w:rPr>
               <w:t xml:space="preserve">Duration</w:t>
             </w:r>
@@ -340,19 +382,25 @@
             </w:tcBorders>
             <w:shd w:fill="FFFFFF" w:val="clear"/>
             <w:tcMar>
-              <w:top w:type="dxa" w:w="80"/>
-              <w:left w:type="dxa" w:w="120"/>
-              <w:bottom w:type="dxa" w:w="80"/>
-              <w:right w:type="dxa" w:w="120"/>
-            </w:tcMar>
-          </w:tcPr>
-          <w:p>
-            <w:r>
-              <w:rPr>
-                <w:rFonts w:ascii="Calibri" w:cs="Calibri" w:eastAsia="Calibri" w:hAnsi="Calibri"/>
-                <w:color w:val="1A1A2E"/>
-                <w:sz w:val="18"/>
-                <w:szCs w:val="18"/>
+              <w:top w:type="dxa" w:w="90"/>
+              <w:left w:type="dxa" w:w="130"/>
+              <w:bottom w:type="dxa" w:w="90"/>
+              <w:right w:type="dxa" w:w="130"/>
+            </w:tcMar>
+            <w:vAlign w:val="center"/>
+          </w:tcPr>
+          <w:p>
+            <w:pPr>
+              <w:jc w:val="left"/>
+            </w:pPr>
+            <w:r>
+              <w:rPr>
+                <w:rFonts w:ascii="Calibri" w:cs="Calibri" w:eastAsia="Calibri" w:hAnsi="Calibri"/>
+                <w:b w:val="false"/>
+                <w:bCs w:val="false"/>
+                <w:color w:val="1A1A2E"/>
+                <w:sz w:val="19"/>
+                <w:szCs w:val="19"/>
               </w:rPr>
               <w:t xml:space="preserve">20 Weeks (5 Months)</w:t>
             </w:r>
@@ -405,7 +453,7 @@
           <w:sz w:val="20"/>
           <w:szCs w:val="20"/>
         </w:rPr>
-        <w:t xml:space="preserve">The AI integration project is planned across five phases over a 20-week period. Each phase corresponds to a deliverable milestone with a client review checkpoint. The project follows an iterative delivery model to ensure continuous alignment with business needs.</w:t>
+        <w:t xml:space="preserve">The AI integration project is planned across five phases over a 20-week period, covering the six AI features agreed in the AI Requirements document. Each phase corresponds to a deliverable milestone with a client review checkpoint.</w:t>
       </w:r>
     </w:p>
     <w:p>
@@ -475,7 +523,7 @@
           <w:sz w:val="20"/>
           <w:szCs w:val="20"/>
         </w:rPr>
-        <w:t xml:space="preserve">  —  Weeks 1–2  |  April 14 – April 25, 2026</w:t>
+        <w:t xml:space="preserve">  —  Weeks 1–2  |  May 4 – May 15, 2026</w:t>
       </w:r>
     </w:p>
     <w:p>
@@ -510,7 +558,7 @@
           <w:sz w:val="20"/>
           <w:szCs w:val="20"/>
         </w:rPr>
-        <w:t xml:space="preserve">Codebase audit and AI integration feasibility assessment</w:t>
+        <w:t xml:space="preserve">Codebase audit and AI integration feasibility assessment against agreed requirements</w:t>
       </w:r>
     </w:p>
     <w:p>
@@ -529,7 +577,7 @@
           <w:sz w:val="20"/>
           <w:szCs w:val="20"/>
         </w:rPr>
-        <w:t xml:space="preserve">Review historical data availability for lead scoring and forecasting models</w:t>
+        <w:t xml:space="preserve">Review existing Activities, Quotes, Rates, Accounts, and Reports modules for integration points</w:t>
       </w:r>
     </w:p>
     <w:p>
@@ -548,7 +596,7 @@
           <w:sz w:val="20"/>
           <w:szCs w:val="20"/>
         </w:rPr>
-        <w:t xml:space="preserve">Define data schemas for AI model inputs and outputs</w:t>
+        <w:t xml:space="preserve">Identify candidate liner sources and customs portals for route and regulation data</w:t>
       </w:r>
     </w:p>
     <w:p>
@@ -567,7 +615,7 @@
           <w:sz w:val="20"/>
           <w:szCs w:val="20"/>
         </w:rPr>
-        <w:t xml:space="preserve">Finalise technical architecture: API endpoints, React component structure, AI provider configuration</w:t>
+        <w:t xml:space="preserve">Define data schemas for AI inputs/outputs and external data caching</w:t>
       </w:r>
     </w:p>
     <w:p>
@@ -586,7 +634,7 @@
           <w:sz w:val="20"/>
           <w:szCs w:val="20"/>
         </w:rPr>
-        <w:t xml:space="preserve">Set up Claude API account and development environment</w:t>
+        <w:t xml:space="preserve">Finalise technical architecture: API endpoints, map integration approach, Claude API setup</w:t>
       </w:r>
     </w:p>
     <w:p>
@@ -605,7 +653,7 @@
           <w:sz w:val="20"/>
           <w:szCs w:val="20"/>
         </w:rPr>
-        <w:t xml:space="preserve">Establish Git branching strategy for AI feature development</w:t>
+        <w:t xml:space="preserve">Set up Claude API account and development environment</w:t>
       </w:r>
     </w:p>
     <w:p>
@@ -678,101 +726,7 @@
           <w:sz w:val="20"/>
           <w:szCs w:val="20"/>
         </w:rPr>
-        <w:t xml:space="preserve">Development environment ready</w:t>
-      </w:r>
-    </w:p>
-    <w:p>
-      <w:pPr>
-        <w:spacing w:after="40" w:before="100"/>
-      </w:pPr>
-      <w:r>
-        <w:rPr>
-          <w:rFonts w:ascii="Calibri" w:cs="Calibri" w:eastAsia="Calibri" w:hAnsi="Calibri"/>
-          <w:b/>
-          <w:bCs/>
-          <w:color w:val="1F4E79"/>
-          <w:sz w:val="20"/>
-          <w:szCs w:val="20"/>
-        </w:rPr>
-        <w:t xml:space="preserve">Milestone Review: </w:t>
-      </w:r>
-      <w:r>
-        <w:rPr>
-          <w:rFonts w:ascii="Calibri" w:cs="Calibri" w:eastAsia="Calibri" w:hAnsi="Calibri"/>
-          <w:b/>
-          <w:bCs/>
-          <w:color w:val="1E7145"/>
-          <w:sz w:val="20"/>
-          <w:szCs w:val="20"/>
-        </w:rPr>
-        <w:t xml:space="preserve">April 25, 2026</w:t>
-      </w:r>
-    </w:p>
-    <w:p>
-      <w:pPr>
-        <w:spacing w:after="0" w:before="0"/>
-      </w:pPr>
-      <w:r>
-        <w:rPr>
-          <w:rFonts w:ascii="Calibri" w:cs="Calibri" w:eastAsia="Calibri" w:hAnsi="Calibri"/>
-          <w:sz w:val="10"/>
-          <w:szCs w:val="10"/>
-        </w:rPr>
-        <w:t xml:space="preserve"/>
-      </w:r>
-    </w:p>
-    <w:p>
-      <w:pPr>
-        <w:pBdr>
-          <w:left w:val="single" w:color="1F7B52" w:sz="24" w:space="0"/>
-        </w:pBdr>
-        <w:shd w:fill="1F7B52" w:val="clear"/>
-        <w:spacing w:after="100" w:before="240"/>
-      </w:pPr>
-      <w:r>
-        <w:rPr>
-          <w:rFonts w:ascii="Calibri" w:cs="Calibri" w:eastAsia="Calibri" w:hAnsi="Calibri"/>
-          <w:b/>
-          <w:bCs/>
-          <w:color w:val="FFFFFF"/>
-          <w:sz w:val="24"/>
-          <w:szCs w:val="24"/>
-        </w:rPr>
-        <w:t xml:space="preserve">  Phase 2: </w:t>
-      </w:r>
-      <w:r>
-        <w:rPr>
-          <w:rFonts w:ascii="Calibri" w:cs="Calibri" w:eastAsia="Calibri" w:hAnsi="Calibri"/>
-          <w:color w:val="FFFFFF"/>
-          <w:sz w:val="24"/>
-          <w:szCs w:val="24"/>
-        </w:rPr>
-        <w:t xml:space="preserve">Core AI Infrastructure &amp; Lead Scoring</w:t>
-      </w:r>
-      <w:r>
-        <w:rPr>
-          <w:rFonts w:ascii="Calibri" w:cs="Calibri" w:eastAsia="Calibri" w:hAnsi="Calibri"/>
-          <w:color w:val="DDDDDD"/>
-          <w:sz w:val="20"/>
-          <w:szCs w:val="20"/>
-        </w:rPr>
-        <w:t xml:space="preserve">  —  Weeks 3–6  |  April 28 – May 23, 2026</w:t>
-      </w:r>
-    </w:p>
-    <w:p>
-      <w:pPr>
-        <w:spacing w:after="40" w:before="80"/>
-      </w:pPr>
-      <w:r>
-        <w:rPr>
-          <w:rFonts w:ascii="Calibri" w:cs="Calibri" w:eastAsia="Calibri" w:hAnsi="Calibri"/>
-          <w:b/>
-          <w:bCs/>
-          <w:color w:val="1F4E79"/>
-          <w:sz w:val="20"/>
-          <w:szCs w:val="20"/>
-        </w:rPr>
-        <w:t xml:space="preserve">Activities:</w:t>
+        <w:t xml:space="preserve">Data source catalogue (liners + customs portals)</w:t>
       </w:r>
     </w:p>
     <w:p>
@@ -791,7 +745,101 @@
           <w:sz w:val="20"/>
           <w:szCs w:val="20"/>
         </w:rPr>
-        <w:t xml:space="preserve">Build AI service layer in .NET backend (new AIController and AI service classes)</w:t>
+        <w:t xml:space="preserve">Development environment ready</w:t>
+      </w:r>
+    </w:p>
+    <w:p>
+      <w:pPr>
+        <w:spacing w:after="40" w:before="100"/>
+      </w:pPr>
+      <w:r>
+        <w:rPr>
+          <w:rFonts w:ascii="Calibri" w:cs="Calibri" w:eastAsia="Calibri" w:hAnsi="Calibri"/>
+          <w:b/>
+          <w:bCs/>
+          <w:color w:val="1F4E79"/>
+          <w:sz w:val="20"/>
+          <w:szCs w:val="20"/>
+        </w:rPr>
+        <w:t xml:space="preserve">Milestone Review: </w:t>
+      </w:r>
+      <w:r>
+        <w:rPr>
+          <w:rFonts w:ascii="Calibri" w:cs="Calibri" w:eastAsia="Calibri" w:hAnsi="Calibri"/>
+          <w:b/>
+          <w:bCs/>
+          <w:color w:val="1E7145"/>
+          <w:sz w:val="20"/>
+          <w:szCs w:val="20"/>
+        </w:rPr>
+        <w:t xml:space="preserve">May 15, 2026</w:t>
+      </w:r>
+    </w:p>
+    <w:p>
+      <w:pPr>
+        <w:spacing w:after="0" w:before="0"/>
+      </w:pPr>
+      <w:r>
+        <w:rPr>
+          <w:rFonts w:ascii="Calibri" w:cs="Calibri" w:eastAsia="Calibri" w:hAnsi="Calibri"/>
+          <w:sz w:val="10"/>
+          <w:szCs w:val="10"/>
+        </w:rPr>
+        <w:t xml:space="preserve"/>
+      </w:r>
+    </w:p>
+    <w:p>
+      <w:pPr>
+        <w:pBdr>
+          <w:left w:val="single" w:color="1F7B52" w:sz="24" w:space="0"/>
+        </w:pBdr>
+        <w:shd w:fill="1F7B52" w:val="clear"/>
+        <w:spacing w:after="100" w:before="240"/>
+      </w:pPr>
+      <w:r>
+        <w:rPr>
+          <w:rFonts w:ascii="Calibri" w:cs="Calibri" w:eastAsia="Calibri" w:hAnsi="Calibri"/>
+          <w:b/>
+          <w:bCs/>
+          <w:color w:val="FFFFFF"/>
+          <w:sz w:val="24"/>
+          <w:szCs w:val="24"/>
+        </w:rPr>
+        <w:t xml:space="preserve">  Phase 2: </w:t>
+      </w:r>
+      <w:r>
+        <w:rPr>
+          <w:rFonts w:ascii="Calibri" w:cs="Calibri" w:eastAsia="Calibri" w:hAnsi="Calibri"/>
+          <w:color w:val="FFFFFF"/>
+          <w:sz w:val="24"/>
+          <w:szCs w:val="24"/>
+        </w:rPr>
+        <w:t xml:space="preserve">Activity — Sales Plan (AI) + User Access Report</w:t>
+      </w:r>
+      <w:r>
+        <w:rPr>
+          <w:rFonts w:ascii="Calibri" w:cs="Calibri" w:eastAsia="Calibri" w:hAnsi="Calibri"/>
+          <w:color w:val="DDDDDD"/>
+          <w:sz w:val="20"/>
+          <w:szCs w:val="20"/>
+        </w:rPr>
+        <w:t xml:space="preserve">  —  Weeks 3–7  |  May 18 – June 19, 2026</w:t>
+      </w:r>
+    </w:p>
+    <w:p>
+      <w:pPr>
+        <w:spacing w:after="40" w:before="80"/>
+      </w:pPr>
+      <w:r>
+        <w:rPr>
+          <w:rFonts w:ascii="Calibri" w:cs="Calibri" w:eastAsia="Calibri" w:hAnsi="Calibri"/>
+          <w:b/>
+          <w:bCs/>
+          <w:color w:val="1F4E79"/>
+          <w:sz w:val="20"/>
+          <w:szCs w:val="20"/>
+        </w:rPr>
+        <w:t xml:space="preserve">Activities:</w:t>
       </w:r>
     </w:p>
     <w:p>
@@ -810,7 +858,7 @@
           <w:sz w:val="20"/>
           <w:szCs w:val="20"/>
         </w:rPr>
-        <w:t xml:space="preserve">Integrate Claude API into backend for NLP tasks</w:t>
+        <w:t xml:space="preserve">Integrate Leaflet / OpenStreetMap into the existing Activities module</w:t>
       </w:r>
     </w:p>
     <w:p>
@@ -829,7 +877,7 @@
           <w:sz w:val="20"/>
           <w:szCs w:val="20"/>
         </w:rPr>
-        <w:t xml:space="preserve">Develop lead scoring algorithm using historical lead and conversion data</w:t>
+        <w:t xml:space="preserve">Implement radius-based nearby-client lookup from existing Accounts data</w:t>
       </w:r>
     </w:p>
     <w:p>
@@ -848,7 +896,7 @@
           <w:sz w:val="20"/>
           <w:szCs w:val="20"/>
         </w:rPr>
-        <w:t xml:space="preserve">Build scoring model training/update pipeline</w:t>
+        <w:t xml:space="preserve">Build visit history analysis with 1/3/6/9/12 month windows</w:t>
       </w:r>
     </w:p>
     <w:p>
@@ -867,7 +915,7 @@
           <w:sz w:val="20"/>
           <w:szCs w:val="20"/>
         </w:rPr>
-        <w:t xml:space="preserve">Integrate lead scores into Lead Management module (frontend)</w:t>
+        <w:t xml:space="preserve">Implement Claude API calls for AI-generated “why not visited” reason summaries</w:t>
       </w:r>
     </w:p>
     <w:p>
@@ -886,7 +934,7 @@
           <w:sz w:val="20"/>
           <w:szCs w:val="20"/>
         </w:rPr>
-        <w:t xml:space="preserve">Implement visual priority indicators and sort-by-score functionality</w:t>
+        <w:t xml:space="preserve">Build frequently-visited clients view (month-wise frequency)</w:t>
       </w:r>
     </w:p>
     <w:p>
@@ -905,23 +953,7 @@
           <w:sz w:val="20"/>
           <w:szCs w:val="20"/>
         </w:rPr>
-        <w:t xml:space="preserve">Unit testing and code review</w:t>
-      </w:r>
-    </w:p>
-    <w:p>
-      <w:pPr>
-        <w:spacing w:after="40" w:before="100"/>
-      </w:pPr>
-      <w:r>
-        <w:rPr>
-          <w:rFonts w:ascii="Calibri" w:cs="Calibri" w:eastAsia="Calibri" w:hAnsi="Calibri"/>
-          <w:b/>
-          <w:bCs/>
-          <w:color w:val="1F4E79"/>
-          <w:sz w:val="20"/>
-          <w:szCs w:val="20"/>
-        </w:rPr>
-        <w:t xml:space="preserve">Deliverables:</w:t>
+        <w:t xml:space="preserve">Implement nearby Importers / Exporters view using existing Lead and Account data</w:t>
       </w:r>
     </w:p>
     <w:p>
@@ -940,7 +972,7 @@
           <w:sz w:val="20"/>
           <w:szCs w:val="20"/>
         </w:rPr>
-        <w:t xml:space="preserve">AI Service Layer (Backend)</w:t>
+        <w:t xml:space="preserve">Build User Last System Access report within existing Reports module with filters and export</w:t>
       </w:r>
     </w:p>
     <w:p>
@@ -959,7 +991,23 @@
           <w:sz w:val="20"/>
           <w:szCs w:val="20"/>
         </w:rPr>
-        <w:t xml:space="preserve">Lead Scoring Engine</w:t>
+        <w:t xml:space="preserve">Unit testing and code review</w:t>
+      </w:r>
+    </w:p>
+    <w:p>
+      <w:pPr>
+        <w:spacing w:after="40" w:before="100"/>
+      </w:pPr>
+      <w:r>
+        <w:rPr>
+          <w:rFonts w:ascii="Calibri" w:cs="Calibri" w:eastAsia="Calibri" w:hAnsi="Calibri"/>
+          <w:b/>
+          <w:bCs/>
+          <w:color w:val="1F4E79"/>
+          <w:sz w:val="20"/>
+          <w:szCs w:val="20"/>
+        </w:rPr>
+        <w:t xml:space="preserve">Deliverables:</w:t>
       </w:r>
     </w:p>
     <w:p>
@@ -978,101 +1026,7 @@
           <w:sz w:val="20"/>
           <w:szCs w:val="20"/>
         </w:rPr>
-        <w:t xml:space="preserve">Updated Leads Module with AI scoring UI</w:t>
-      </w:r>
-    </w:p>
-    <w:p>
-      <w:pPr>
-        <w:spacing w:after="40" w:before="100"/>
-      </w:pPr>
-      <w:r>
-        <w:rPr>
-          <w:rFonts w:ascii="Calibri" w:cs="Calibri" w:eastAsia="Calibri" w:hAnsi="Calibri"/>
-          <w:b/>
-          <w:bCs/>
-          <w:color w:val="1F4E79"/>
-          <w:sz w:val="20"/>
-          <w:szCs w:val="20"/>
-        </w:rPr>
-        <w:t xml:space="preserve">Milestone Review: </w:t>
-      </w:r>
-      <w:r>
-        <w:rPr>
-          <w:rFonts w:ascii="Calibri" w:cs="Calibri" w:eastAsia="Calibri" w:hAnsi="Calibri"/>
-          <w:b/>
-          <w:bCs/>
-          <w:color w:val="1E7145"/>
-          <w:sz w:val="20"/>
-          <w:szCs w:val="20"/>
-        </w:rPr>
-        <w:t xml:space="preserve">May 23, 2026</w:t>
-      </w:r>
-    </w:p>
-    <w:p>
-      <w:pPr>
-        <w:spacing w:after="0" w:before="0"/>
-      </w:pPr>
-      <w:r>
-        <w:rPr>
-          <w:rFonts w:ascii="Calibri" w:cs="Calibri" w:eastAsia="Calibri" w:hAnsi="Calibri"/>
-          <w:sz w:val="10"/>
-          <w:szCs w:val="10"/>
-        </w:rPr>
-        <w:t xml:space="preserve"/>
-      </w:r>
-    </w:p>
-    <w:p>
-      <w:pPr>
-        <w:pBdr>
-          <w:left w:val="single" w:color="7B3EA5" w:sz="24" w:space="0"/>
-        </w:pBdr>
-        <w:shd w:fill="7B3EA5" w:val="clear"/>
-        <w:spacing w:after="100" w:before="240"/>
-      </w:pPr>
-      <w:r>
-        <w:rPr>
-          <w:rFonts w:ascii="Calibri" w:cs="Calibri" w:eastAsia="Calibri" w:hAnsi="Calibri"/>
-          <w:b/>
-          <w:bCs/>
-          <w:color w:val="FFFFFF"/>
-          <w:sz w:val="24"/>
-          <w:szCs w:val="24"/>
-        </w:rPr>
-        <w:t xml:space="preserve">  Phase 3: </w:t>
-      </w:r>
-      <w:r>
-        <w:rPr>
-          <w:rFonts w:ascii="Calibri" w:cs="Calibri" w:eastAsia="Calibri" w:hAnsi="Calibri"/>
-          <w:color w:val="FFFFFF"/>
-          <w:sz w:val="24"/>
-          <w:szCs w:val="24"/>
-        </w:rPr>
-        <w:t xml:space="preserve">Quote Recommendations &amp; Smart Documents</w:t>
-      </w:r>
-      <w:r>
-        <w:rPr>
-          <w:rFonts w:ascii="Calibri" w:cs="Calibri" w:eastAsia="Calibri" w:hAnsi="Calibri"/>
-          <w:color w:val="DDDDDD"/>
-          <w:sz w:val="20"/>
-          <w:szCs w:val="20"/>
-        </w:rPr>
-        <w:t xml:space="preserve">  —  Weeks 7–11  |  May 26 – June 27, 2026</w:t>
-      </w:r>
-    </w:p>
-    <w:p>
-      <w:pPr>
-        <w:spacing w:after="40" w:before="80"/>
-      </w:pPr>
-      <w:r>
-        <w:rPr>
-          <w:rFonts w:ascii="Calibri" w:cs="Calibri" w:eastAsia="Calibri" w:hAnsi="Calibri"/>
-          <w:b/>
-          <w:bCs/>
-          <w:color w:val="1F4E79"/>
-          <w:sz w:val="20"/>
-          <w:szCs w:val="20"/>
-        </w:rPr>
-        <w:t xml:space="preserve">Activities:</w:t>
+        <w:t xml:space="preserve">AI-enhanced Sales Plan screen with map and radius filter</w:t>
       </w:r>
     </w:p>
     <w:p>
@@ -1091,7 +1045,7 @@
           <w:sz w:val="20"/>
           <w:szCs w:val="20"/>
         </w:rPr>
-        <w:t xml:space="preserve">Develop historical rate analysis engine from existing quote and rates data</w:t>
+        <w:t xml:space="preserve">Visit history and frequency analytics</w:t>
       </w:r>
     </w:p>
     <w:p>
@@ -1110,7 +1064,7 @@
           <w:sz w:val="20"/>
           <w:szCs w:val="20"/>
         </w:rPr>
-        <w:t xml:space="preserve">Build recommendation panel component (React) for quote creation forms</w:t>
+        <w:t xml:space="preserve">Nearby Importers / Exporters view</w:t>
       </w:r>
     </w:p>
     <w:p>
@@ -1129,7 +1083,101 @@
           <w:sz w:val="20"/>
           <w:szCs w:val="20"/>
         </w:rPr>
-        <w:t xml:space="preserve">Implement auto-fill and anomaly detection for quote rates</w:t>
+        <w:t xml:space="preserve">User Last System Access report</w:t>
+      </w:r>
+    </w:p>
+    <w:p>
+      <w:pPr>
+        <w:spacing w:after="40" w:before="100"/>
+      </w:pPr>
+      <w:r>
+        <w:rPr>
+          <w:rFonts w:ascii="Calibri" w:cs="Calibri" w:eastAsia="Calibri" w:hAnsi="Calibri"/>
+          <w:b/>
+          <w:bCs/>
+          <w:color w:val="1F4E79"/>
+          <w:sz w:val="20"/>
+          <w:szCs w:val="20"/>
+        </w:rPr>
+        <w:t xml:space="preserve">Milestone Review: </w:t>
+      </w:r>
+      <w:r>
+        <w:rPr>
+          <w:rFonts w:ascii="Calibri" w:cs="Calibri" w:eastAsia="Calibri" w:hAnsi="Calibri"/>
+          <w:b/>
+          <w:bCs/>
+          <w:color w:val="1E7145"/>
+          <w:sz w:val="20"/>
+          <w:szCs w:val="20"/>
+        </w:rPr>
+        <w:t xml:space="preserve">June 19, 2026</w:t>
+      </w:r>
+    </w:p>
+    <w:p>
+      <w:pPr>
+        <w:spacing w:after="0" w:before="0"/>
+      </w:pPr>
+      <w:r>
+        <w:rPr>
+          <w:rFonts w:ascii="Calibri" w:cs="Calibri" w:eastAsia="Calibri" w:hAnsi="Calibri"/>
+          <w:sz w:val="10"/>
+          <w:szCs w:val="10"/>
+        </w:rPr>
+        <w:t xml:space="preserve"/>
+      </w:r>
+    </w:p>
+    <w:p>
+      <w:pPr>
+        <w:pBdr>
+          <w:left w:val="single" w:color="7B3EA5" w:sz="24" w:space="0"/>
+        </w:pBdr>
+        <w:shd w:fill="7B3EA5" w:val="clear"/>
+        <w:spacing w:after="100" w:before="240"/>
+      </w:pPr>
+      <w:r>
+        <w:rPr>
+          <w:rFonts w:ascii="Calibri" w:cs="Calibri" w:eastAsia="Calibri" w:hAnsi="Calibri"/>
+          <w:b/>
+          <w:bCs/>
+          <w:color w:val="FFFFFF"/>
+          <w:sz w:val="24"/>
+          <w:szCs w:val="24"/>
+        </w:rPr>
+        <w:t xml:space="preserve">  Phase 3: </w:t>
+      </w:r>
+      <w:r>
+        <w:rPr>
+          <w:rFonts w:ascii="Calibri" w:cs="Calibri" w:eastAsia="Calibri" w:hAnsi="Calibri"/>
+          <w:color w:val="FFFFFF"/>
+          <w:sz w:val="24"/>
+          <w:szCs w:val="24"/>
+        </w:rPr>
+        <w:t xml:space="preserve">Quote Options (AI) + Rates Management (Location-Based)</w:t>
+      </w:r>
+      <w:r>
+        <w:rPr>
+          <w:rFonts w:ascii="Calibri" w:cs="Calibri" w:eastAsia="Calibri" w:hAnsi="Calibri"/>
+          <w:color w:val="DDDDDD"/>
+          <w:sz w:val="20"/>
+          <w:szCs w:val="20"/>
+        </w:rPr>
+        <w:t xml:space="preserve">  —  Weeks 8–11  |  June 22 – July 17, 2026</w:t>
+      </w:r>
+    </w:p>
+    <w:p>
+      <w:pPr>
+        <w:spacing w:after="40" w:before="80"/>
+      </w:pPr>
+      <w:r>
+        <w:rPr>
+          <w:rFonts w:ascii="Calibri" w:cs="Calibri" w:eastAsia="Calibri" w:hAnsi="Calibri"/>
+          <w:b/>
+          <w:bCs/>
+          <w:color w:val="1F4E79"/>
+          <w:sz w:val="20"/>
+          <w:szCs w:val="20"/>
+        </w:rPr>
+        <w:t xml:space="preserve">Activities:</w:t>
       </w:r>
     </w:p>
     <w:p>
@@ -1148,7 +1196,7 @@
           <w:sz w:val="20"/>
           <w:szCs w:val="20"/>
         </w:rPr>
-        <w:t xml:space="preserve">Develop AI-assisted PDF generation for quotes and invoices</w:t>
+        <w:t xml:space="preserve">Analyse historical quote data patterns for origin/destination/commodity combinations</w:t>
       </w:r>
     </w:p>
     <w:p>
@@ -1167,7 +1215,7 @@
           <w:sz w:val="20"/>
           <w:szCs w:val="20"/>
         </w:rPr>
-        <w:t xml:space="preserve">Implement email draft generation using Claude API with CRM context injection</w:t>
+        <w:t xml:space="preserve">Build Quote Options AI panel (React) integrated into Direct, Transit, and Warehouse quote flows</w:t>
       </w:r>
     </w:p>
     <w:p>
@@ -1186,7 +1234,7 @@
           <w:sz w:val="20"/>
           <w:szCs w:val="20"/>
         </w:rPr>
-        <w:t xml:space="preserve">Add “Generate with AI” buttons to Quote and Invoice modules</w:t>
+        <w:t xml:space="preserve">Implement Claude API integration for generating option variants (fastest, economical, preferred)</w:t>
       </w:r>
     </w:p>
     <w:p>
@@ -1205,23 +1253,7 @@
           <w:sz w:val="20"/>
           <w:szCs w:val="20"/>
         </w:rPr>
-        <w:t xml:space="preserve">Integration testing across quote modes (Direct, Transit, Warehouse)</w:t>
-      </w:r>
-    </w:p>
-    <w:p>
-      <w:pPr>
-        <w:spacing w:after="40" w:before="100"/>
-      </w:pPr>
-      <w:r>
-        <w:rPr>
-          <w:rFonts w:ascii="Calibri" w:cs="Calibri" w:eastAsia="Calibri" w:hAnsi="Calibri"/>
-          <w:b/>
-          <w:bCs/>
-          <w:color w:val="1F4E79"/>
-          <w:sz w:val="20"/>
-          <w:szCs w:val="20"/>
-        </w:rPr>
-        <w:t xml:space="preserve">Deliverables:</w:t>
+        <w:t xml:space="preserve">Develop location-based rates lookup screen within the Rates module</w:t>
       </w:r>
     </w:p>
     <w:p>
@@ -1240,7 +1272,7 @@
           <w:sz w:val="20"/>
           <w:szCs w:val="20"/>
         </w:rPr>
-        <w:t xml:space="preserve">Quote Recommendation Engine</w:t>
+        <w:t xml:space="preserve">Implement origin→destination rate retrieval across Air Export/Import and Sea FCL/LCL</w:t>
       </w:r>
     </w:p>
     <w:p>
@@ -1259,7 +1291,7 @@
           <w:sz w:val="20"/>
           <w:szCs w:val="20"/>
         </w:rPr>
-        <w:t xml:space="preserve">Smart Document Generation Feature</w:t>
+        <w:t xml:space="preserve">Show historical rate trends for selected lanes</w:t>
       </w:r>
     </w:p>
     <w:p>
@@ -1278,7 +1310,7 @@
           <w:sz w:val="20"/>
           <w:szCs w:val="20"/>
         </w:rPr>
-        <w:t xml:space="preserve">AI-Enhanced Quote and Invoice Modules</w:t>
+        <w:t xml:space="preserve">Integration testing across quote modes and rate types</w:t>
       </w:r>
     </w:p>
     <w:p>
@@ -1294,85 +1326,7 @@
           <w:sz w:val="20"/>
           <w:szCs w:val="20"/>
         </w:rPr>
-        <w:t xml:space="preserve">Milestone Review: </w:t>
-      </w:r>
-      <w:r>
-        <w:rPr>
-          <w:rFonts w:ascii="Calibri" w:cs="Calibri" w:eastAsia="Calibri" w:hAnsi="Calibri"/>
-          <w:b/>
-          <w:bCs/>
-          <w:color w:val="1E7145"/>
-          <w:sz w:val="20"/>
-          <w:szCs w:val="20"/>
-        </w:rPr>
-        <w:t xml:space="preserve">June 27, 2026</w:t>
-      </w:r>
-    </w:p>
-    <w:p>
-      <w:pPr>
-        <w:spacing w:after="0" w:before="0"/>
-      </w:pPr>
-      <w:r>
-        <w:rPr>
-          <w:rFonts w:ascii="Calibri" w:cs="Calibri" w:eastAsia="Calibri" w:hAnsi="Calibri"/>
-          <w:sz w:val="10"/>
-          <w:szCs w:val="10"/>
-        </w:rPr>
-        <w:t xml:space="preserve"/>
-      </w:r>
-    </w:p>
-    <w:p>
-      <w:pPr>
-        <w:pBdr>
-          <w:left w:val="single" w:color="B85C1A" w:sz="24" w:space="0"/>
-        </w:pBdr>
-        <w:shd w:fill="B85C1A" w:val="clear"/>
-        <w:spacing w:after="100" w:before="240"/>
-      </w:pPr>
-      <w:r>
-        <w:rPr>
-          <w:rFonts w:ascii="Calibri" w:cs="Calibri" w:eastAsia="Calibri" w:hAnsi="Calibri"/>
-          <w:b/>
-          <w:bCs/>
-          <w:color w:val="FFFFFF"/>
-          <w:sz w:val="24"/>
-          <w:szCs w:val="24"/>
-        </w:rPr>
-        <w:t xml:space="preserve">  Phase 4: </w:t>
-      </w:r>
-      <w:r>
-        <w:rPr>
-          <w:rFonts w:ascii="Calibri" w:cs="Calibri" w:eastAsia="Calibri" w:hAnsi="Calibri"/>
-          <w:color w:val="FFFFFF"/>
-          <w:sz w:val="24"/>
-          <w:szCs w:val="24"/>
-        </w:rPr>
-        <w:t xml:space="preserve">Sales Forecasting Dashboard &amp; AI Assistant</w:t>
-      </w:r>
-      <w:r>
-        <w:rPr>
-          <w:rFonts w:ascii="Calibri" w:cs="Calibri" w:eastAsia="Calibri" w:hAnsi="Calibri"/>
-          <w:color w:val="DDDDDD"/>
-          <w:sz w:val="20"/>
-          <w:szCs w:val="20"/>
-        </w:rPr>
-        <w:t xml:space="preserve">  —  Weeks 12–17  |  June 30 – August 8, 2026</w:t>
-      </w:r>
-    </w:p>
-    <w:p>
-      <w:pPr>
-        <w:spacing w:after="40" w:before="80"/>
-      </w:pPr>
-      <w:r>
-        <w:rPr>
-          <w:rFonts w:ascii="Calibri" w:cs="Calibri" w:eastAsia="Calibri" w:hAnsi="Calibri"/>
-          <w:b/>
-          <w:bCs/>
-          <w:color w:val="1F4E79"/>
-          <w:sz w:val="20"/>
-          <w:szCs w:val="20"/>
-        </w:rPr>
-        <w:t xml:space="preserve">Activities:</w:t>
+        <w:t xml:space="preserve">Deliverables:</w:t>
       </w:r>
     </w:p>
     <w:p>
@@ -1391,7 +1345,7 @@
           <w:sz w:val="20"/>
           <w:szCs w:val="20"/>
         </w:rPr>
-        <w:t xml:space="preserve">Build statistical forecasting model using pipeline and closed deal data</w:t>
+        <w:t xml:space="preserve">Quote Options AI panel integrated into quote creation</w:t>
       </w:r>
     </w:p>
     <w:p>
@@ -1410,7 +1364,7 @@
           <w:sz w:val="20"/>
           <w:szCs w:val="20"/>
         </w:rPr>
-        <w:t xml:space="preserve">Develop AI Insights section within the Reports module</w:t>
+        <w:t xml:space="preserve">Location-based Rates lookup view</w:t>
       </w:r>
     </w:p>
     <w:p>
@@ -1429,7 +1383,101 @@
           <w:sz w:val="20"/>
           <w:szCs w:val="20"/>
         </w:rPr>
-        <w:t xml:space="preserve">Implement monthly/quarterly trend charts and target attainment indicators</w:t>
+        <w:t xml:space="preserve">Historical rate trend display</w:t>
+      </w:r>
+    </w:p>
+    <w:p>
+      <w:pPr>
+        <w:spacing w:after="40" w:before="100"/>
+      </w:pPr>
+      <w:r>
+        <w:rPr>
+          <w:rFonts w:ascii="Calibri" w:cs="Calibri" w:eastAsia="Calibri" w:hAnsi="Calibri"/>
+          <w:b/>
+          <w:bCs/>
+          <w:color w:val="1F4E79"/>
+          <w:sz w:val="20"/>
+          <w:szCs w:val="20"/>
+        </w:rPr>
+        <w:t xml:space="preserve">Milestone Review: </w:t>
+      </w:r>
+      <w:r>
+        <w:rPr>
+          <w:rFonts w:ascii="Calibri" w:cs="Calibri" w:eastAsia="Calibri" w:hAnsi="Calibri"/>
+          <w:b/>
+          <w:bCs/>
+          <w:color w:val="1E7145"/>
+          <w:sz w:val="20"/>
+          <w:szCs w:val="20"/>
+        </w:rPr>
+        <w:t xml:space="preserve">July 17, 2026</w:t>
+      </w:r>
+    </w:p>
+    <w:p>
+      <w:pPr>
+        <w:spacing w:after="0" w:before="0"/>
+      </w:pPr>
+      <w:r>
+        <w:rPr>
+          <w:rFonts w:ascii="Calibri" w:cs="Calibri" w:eastAsia="Calibri" w:hAnsi="Calibri"/>
+          <w:sz w:val="10"/>
+          <w:szCs w:val="10"/>
+        </w:rPr>
+        <w:t xml:space="preserve"/>
+      </w:r>
+    </w:p>
+    <w:p>
+      <w:pPr>
+        <w:pBdr>
+          <w:left w:val="single" w:color="B85C1A" w:sz="24" w:space="0"/>
+        </w:pBdr>
+        <w:shd w:fill="B85C1A" w:val="clear"/>
+        <w:spacing w:after="100" w:before="240"/>
+      </w:pPr>
+      <w:r>
+        <w:rPr>
+          <w:rFonts w:ascii="Calibri" w:cs="Calibri" w:eastAsia="Calibri" w:hAnsi="Calibri"/>
+          <w:b/>
+          <w:bCs/>
+          <w:color w:val="FFFFFF"/>
+          <w:sz w:val="24"/>
+          <w:szCs w:val="24"/>
+        </w:rPr>
+        <w:t xml:space="preserve">  Phase 4: </w:t>
+      </w:r>
+      <w:r>
+        <w:rPr>
+          <w:rFonts w:ascii="Calibri" w:cs="Calibri" w:eastAsia="Calibri" w:hAnsi="Calibri"/>
+          <w:color w:val="FFFFFF"/>
+          <w:sz w:val="24"/>
+          <w:szCs w:val="24"/>
+        </w:rPr>
+        <w:t xml:space="preserve">Shipping Route Management + Commodity Regulation</w:t>
+      </w:r>
+      <w:r>
+        <w:rPr>
+          <w:rFonts w:ascii="Calibri" w:cs="Calibri" w:eastAsia="Calibri" w:hAnsi="Calibri"/>
+          <w:color w:val="DDDDDD"/>
+          <w:sz w:val="20"/>
+          <w:szCs w:val="20"/>
+        </w:rPr>
+        <w:t xml:space="preserve">  —  Weeks 12–17  |  July 20 – August 28, 2026</w:t>
+      </w:r>
+    </w:p>
+    <w:p>
+      <w:pPr>
+        <w:spacing w:after="40" w:before="80"/>
+      </w:pPr>
+      <w:r>
+        <w:rPr>
+          <w:rFonts w:ascii="Calibri" w:cs="Calibri" w:eastAsia="Calibri" w:hAnsi="Calibri"/>
+          <w:b/>
+          <w:bCs/>
+          <w:color w:val="1F4E79"/>
+          <w:sz w:val="20"/>
+          <w:szCs w:val="20"/>
+        </w:rPr>
+        <w:t xml:space="preserve">Activities:</w:t>
       </w:r>
     </w:p>
     <w:p>
@@ -1448,7 +1496,7 @@
           <w:sz w:val="20"/>
           <w:szCs w:val="20"/>
         </w:rPr>
-        <w:t xml:space="preserve">Design and build AI Assistant chat interface component</w:t>
+        <w:t xml:space="preserve">Design and build Shipping Route Management module</w:t>
       </w:r>
     </w:p>
     <w:p>
@@ -1467,7 +1515,7 @@
           <w:sz w:val="20"/>
           <w:szCs w:val="20"/>
         </w:rPr>
-        <w:t xml:space="preserve">Implement CRM data query resolution (natural language to SQL/API calls)</w:t>
+        <w:t xml:space="preserve">Implement start→end location input with liner schedule and route retrieval</w:t>
       </w:r>
     </w:p>
     <w:p>
@@ -1486,7 +1534,7 @@
           <w:sz w:val="20"/>
           <w:szCs w:val="20"/>
         </w:rPr>
-        <w:t xml:space="preserve">Integrate AI Assistant panel into application shell (accessible from all modules)</w:t>
+        <w:t xml:space="preserve">Build AI-driven extraction pipeline for liner portals (schedules, routes, local agent info)</w:t>
       </w:r>
     </w:p>
     <w:p>
@@ -1505,23 +1553,7 @@
           <w:sz w:val="20"/>
           <w:szCs w:val="20"/>
         </w:rPr>
-        <w:t xml:space="preserve">End-to-end integration testing of all AI features together</w:t>
-      </w:r>
-    </w:p>
-    <w:p>
-      <w:pPr>
-        <w:spacing w:after="40" w:before="100"/>
-      </w:pPr>
-      <w:r>
-        <w:rPr>
-          <w:rFonts w:ascii="Calibri" w:cs="Calibri" w:eastAsia="Calibri" w:hAnsi="Calibri"/>
-          <w:b/>
-          <w:bCs/>
-          <w:color w:val="1F4E79"/>
-          <w:sz w:val="20"/>
-          <w:szCs w:val="20"/>
-        </w:rPr>
-        <w:t xml:space="preserve">Deliverables:</w:t>
+        <w:t xml:space="preserve">Integrate generated route/schedule references into the existing Useful Links section</w:t>
       </w:r>
     </w:p>
     <w:p>
@@ -1540,7 +1572,7 @@
           <w:sz w:val="20"/>
           <w:szCs w:val="20"/>
         </w:rPr>
-        <w:t xml:space="preserve">AI Sales Forecasting Dashboard</w:t>
+        <w:t xml:space="preserve">Build Commodity Regulation lookup screen with HS Code + country selection</w:t>
       </w:r>
     </w:p>
     <w:p>
@@ -1559,7 +1591,7 @@
           <w:sz w:val="20"/>
           <w:szCs w:val="20"/>
         </w:rPr>
-        <w:t xml:space="preserve">Internal AI Assistant (Chat Interface)</w:t>
+        <w:t xml:space="preserve">Implement AI-driven retrieval from customs sites for regulations, certifications, requirements</w:t>
       </w:r>
     </w:p>
     <w:p>
@@ -1578,101 +1610,7 @@
           <w:sz w:val="20"/>
           <w:szCs w:val="20"/>
         </w:rPr>
-        <w:t xml:space="preserve">Full AI Feature Integration</w:t>
-      </w:r>
-    </w:p>
-    <w:p>
-      <w:pPr>
-        <w:spacing w:after="40" w:before="100"/>
-      </w:pPr>
-      <w:r>
-        <w:rPr>
-          <w:rFonts w:ascii="Calibri" w:cs="Calibri" w:eastAsia="Calibri" w:hAnsi="Calibri"/>
-          <w:b/>
-          <w:bCs/>
-          <w:color w:val="1F4E79"/>
-          <w:sz w:val="20"/>
-          <w:szCs w:val="20"/>
-        </w:rPr>
-        <w:t xml:space="preserve">Milestone Review: </w:t>
-      </w:r>
-      <w:r>
-        <w:rPr>
-          <w:rFonts w:ascii="Calibri" w:cs="Calibri" w:eastAsia="Calibri" w:hAnsi="Calibri"/>
-          <w:b/>
-          <w:bCs/>
-          <w:color w:val="1E7145"/>
-          <w:sz w:val="20"/>
-          <w:szCs w:val="20"/>
-        </w:rPr>
-        <w:t xml:space="preserve">August 8, 2026</w:t>
-      </w:r>
-    </w:p>
-    <w:p>
-      <w:pPr>
-        <w:spacing w:after="0" w:before="0"/>
-      </w:pPr>
-      <w:r>
-        <w:rPr>
-          <w:rFonts w:ascii="Calibri" w:cs="Calibri" w:eastAsia="Calibri" w:hAnsi="Calibri"/>
-          <w:sz w:val="10"/>
-          <w:szCs w:val="10"/>
-        </w:rPr>
-        <w:t xml:space="preserve"/>
-      </w:r>
-    </w:p>
-    <w:p>
-      <w:pPr>
-        <w:pBdr>
-          <w:left w:val="single" w:color="8B1A1A" w:sz="24" w:space="0"/>
-        </w:pBdr>
-        <w:shd w:fill="8B1A1A" w:val="clear"/>
-        <w:spacing w:after="100" w:before="240"/>
-      </w:pPr>
-      <w:r>
-        <w:rPr>
-          <w:rFonts w:ascii="Calibri" w:cs="Calibri" w:eastAsia="Calibri" w:hAnsi="Calibri"/>
-          <w:b/>
-          <w:bCs/>
-          <w:color w:val="FFFFFF"/>
-          <w:sz w:val="24"/>
-          <w:szCs w:val="24"/>
-        </w:rPr>
-        <w:t xml:space="preserve">  Phase 5: </w:t>
-      </w:r>
-      <w:r>
-        <w:rPr>
-          <w:rFonts w:ascii="Calibri" w:cs="Calibri" w:eastAsia="Calibri" w:hAnsi="Calibri"/>
-          <w:color w:val="FFFFFF"/>
-          <w:sz w:val="24"/>
-          <w:szCs w:val="24"/>
-        </w:rPr>
-        <w:t xml:space="preserve">UAT, Refinement &amp; Deployment</w:t>
-      </w:r>
-      <w:r>
-        <w:rPr>
-          <w:rFonts w:ascii="Calibri" w:cs="Calibri" w:eastAsia="Calibri" w:hAnsi="Calibri"/>
-          <w:color w:val="DDDDDD"/>
-          <w:sz w:val="20"/>
-          <w:szCs w:val="20"/>
-        </w:rPr>
-        <w:t xml:space="preserve">  —  Weeks 18–20  |  August 11 – September 5, 2026</w:t>
-      </w:r>
-    </w:p>
-    <w:p>
-      <w:pPr>
-        <w:spacing w:after="40" w:before="80"/>
-      </w:pPr>
-      <w:r>
-        <w:rPr>
-          <w:rFonts w:ascii="Calibri" w:cs="Calibri" w:eastAsia="Calibri" w:hAnsi="Calibri"/>
-          <w:b/>
-          <w:bCs/>
-          <w:color w:val="1F4E79"/>
-          <w:sz w:val="20"/>
-          <w:szCs w:val="20"/>
-        </w:rPr>
-        <w:t xml:space="preserve">Activities:</w:t>
+        <w:t xml:space="preserve">Display results with readable summaries and source link attribution</w:t>
       </w:r>
     </w:p>
     <w:p>
@@ -1691,7 +1629,7 @@
           <w:sz w:val="20"/>
           <w:szCs w:val="20"/>
         </w:rPr>
-        <w:t xml:space="preserve">User Acceptance Testing (UAT) with client stakeholders across all five AI features</w:t>
+        <w:t xml:space="preserve">Integrate Shipping Route data with the existing Quote module for quick reference</w:t>
       </w:r>
     </w:p>
     <w:p>
@@ -1710,7 +1648,23 @@
           <w:sz w:val="20"/>
           <w:szCs w:val="20"/>
         </w:rPr>
-        <w:t xml:space="preserve">Bug fixes and performance optimisations based on UAT feedback</w:t>
+        <w:t xml:space="preserve">End-to-end integration testing across all six AI features</w:t>
+      </w:r>
+    </w:p>
+    <w:p>
+      <w:pPr>
+        <w:spacing w:after="40" w:before="100"/>
+      </w:pPr>
+      <w:r>
+        <w:rPr>
+          <w:rFonts w:ascii="Calibri" w:cs="Calibri" w:eastAsia="Calibri" w:hAnsi="Calibri"/>
+          <w:b/>
+          <w:bCs/>
+          <w:color w:val="1F4E79"/>
+          <w:sz w:val="20"/>
+          <w:szCs w:val="20"/>
+        </w:rPr>
+        <w:t xml:space="preserve">Deliverables:</w:t>
       </w:r>
     </w:p>
     <w:p>
@@ -1729,7 +1683,7 @@
           <w:sz w:val="20"/>
           <w:szCs w:val="20"/>
         </w:rPr>
-        <w:t xml:space="preserve">Security review and penetration testing of new AI endpoints</w:t>
+        <w:t xml:space="preserve">Shipping Route Management module (with Useful Links integration)</w:t>
       </w:r>
     </w:p>
     <w:p>
@@ -1748,7 +1702,7 @@
           <w:sz w:val="20"/>
           <w:szCs w:val="20"/>
         </w:rPr>
-        <w:t xml:space="preserve">Production deployment to https://crm.scanwellapps.com</w:t>
+        <w:t xml:space="preserve">Commodity Regulation lookup module</w:t>
       </w:r>
     </w:p>
     <w:p>
@@ -1767,7 +1721,101 @@
           <w:sz w:val="20"/>
           <w:szCs w:val="20"/>
         </w:rPr>
-        <w:t xml:space="preserve">Post-deployment smoke testing</w:t>
+        <w:t xml:space="preserve">Full AI feature integration verified</w:t>
+      </w:r>
+    </w:p>
+    <w:p>
+      <w:pPr>
+        <w:spacing w:after="40" w:before="100"/>
+      </w:pPr>
+      <w:r>
+        <w:rPr>
+          <w:rFonts w:ascii="Calibri" w:cs="Calibri" w:eastAsia="Calibri" w:hAnsi="Calibri"/>
+          <w:b/>
+          <w:bCs/>
+          <w:color w:val="1F4E79"/>
+          <w:sz w:val="20"/>
+          <w:szCs w:val="20"/>
+        </w:rPr>
+        <w:t xml:space="preserve">Milestone Review: </w:t>
+      </w:r>
+      <w:r>
+        <w:rPr>
+          <w:rFonts w:ascii="Calibri" w:cs="Calibri" w:eastAsia="Calibri" w:hAnsi="Calibri"/>
+          <w:b/>
+          <w:bCs/>
+          <w:color w:val="1E7145"/>
+          <w:sz w:val="20"/>
+          <w:szCs w:val="20"/>
+        </w:rPr>
+        <w:t xml:space="preserve">August 28, 2026</w:t>
+      </w:r>
+    </w:p>
+    <w:p>
+      <w:pPr>
+        <w:spacing w:after="0" w:before="0"/>
+      </w:pPr>
+      <w:r>
+        <w:rPr>
+          <w:rFonts w:ascii="Calibri" w:cs="Calibri" w:eastAsia="Calibri" w:hAnsi="Calibri"/>
+          <w:sz w:val="10"/>
+          <w:szCs w:val="10"/>
+        </w:rPr>
+        <w:t xml:space="preserve"/>
+      </w:r>
+    </w:p>
+    <w:p>
+      <w:pPr>
+        <w:pBdr>
+          <w:left w:val="single" w:color="8B1A1A" w:sz="24" w:space="0"/>
+        </w:pBdr>
+        <w:shd w:fill="8B1A1A" w:val="clear"/>
+        <w:spacing w:after="100" w:before="240"/>
+      </w:pPr>
+      <w:r>
+        <w:rPr>
+          <w:rFonts w:ascii="Calibri" w:cs="Calibri" w:eastAsia="Calibri" w:hAnsi="Calibri"/>
+          <w:b/>
+          <w:bCs/>
+          <w:color w:val="FFFFFF"/>
+          <w:sz w:val="24"/>
+          <w:szCs w:val="24"/>
+        </w:rPr>
+        <w:t xml:space="preserve">  Phase 5: </w:t>
+      </w:r>
+      <w:r>
+        <w:rPr>
+          <w:rFonts w:ascii="Calibri" w:cs="Calibri" w:eastAsia="Calibri" w:hAnsi="Calibri"/>
+          <w:color w:val="FFFFFF"/>
+          <w:sz w:val="24"/>
+          <w:szCs w:val="24"/>
+        </w:rPr>
+        <w:t xml:space="preserve">UAT, Refinement &amp; Deployment</w:t>
+      </w:r>
+      <w:r>
+        <w:rPr>
+          <w:rFonts w:ascii="Calibri" w:cs="Calibri" w:eastAsia="Calibri" w:hAnsi="Calibri"/>
+          <w:color w:val="DDDDDD"/>
+          <w:sz w:val="20"/>
+          <w:szCs w:val="20"/>
+        </w:rPr>
+        <w:t xml:space="preserve">  —  Weeks 18–20  |  August 31 – September 18, 2026</w:t>
+      </w:r>
+    </w:p>
+    <w:p>
+      <w:pPr>
+        <w:spacing w:after="40" w:before="80"/>
+      </w:pPr>
+      <w:r>
+        <w:rPr>
+          <w:rFonts w:ascii="Calibri" w:cs="Calibri" w:eastAsia="Calibri" w:hAnsi="Calibri"/>
+          <w:b/>
+          <w:bCs/>
+          <w:color w:val="1F4E79"/>
+          <w:sz w:val="20"/>
+          <w:szCs w:val="20"/>
+        </w:rPr>
+        <w:t xml:space="preserve">Activities:</w:t>
       </w:r>
     </w:p>
     <w:p>
@@ -1786,7 +1834,7 @@
           <w:sz w:val="20"/>
           <w:szCs w:val="20"/>
         </w:rPr>
-        <w:t xml:space="preserve">Handover documentation and knowledge transfer</w:t>
+        <w:t xml:space="preserve">User Acceptance Testing with client stakeholders across all six AI features</w:t>
       </w:r>
     </w:p>
     <w:p>
@@ -1805,23 +1853,7 @@
           <w:sz w:val="20"/>
           <w:szCs w:val="20"/>
         </w:rPr>
-        <w:t xml:space="preserve">Final project sign-off</w:t>
-      </w:r>
-    </w:p>
-    <w:p>
-      <w:pPr>
-        <w:spacing w:after="40" w:before="100"/>
-      </w:pPr>
-      <w:r>
-        <w:rPr>
-          <w:rFonts w:ascii="Calibri" w:cs="Calibri" w:eastAsia="Calibri" w:hAnsi="Calibri"/>
-          <w:b/>
-          <w:bCs/>
-          <w:color w:val="1F4E79"/>
-          <w:sz w:val="20"/>
-          <w:szCs w:val="20"/>
-        </w:rPr>
-        <w:t xml:space="preserve">Deliverables:</w:t>
+        <w:t xml:space="preserve">Bug fixes and performance optimisations based on UAT feedback</w:t>
       </w:r>
     </w:p>
     <w:p>
@@ -1840,7 +1872,7 @@
           <w:sz w:val="20"/>
           <w:szCs w:val="20"/>
         </w:rPr>
-        <w:t xml:space="preserve">UAT Sign-Off Report</w:t>
+        <w:t xml:space="preserve">Security review and penetration testing of new AI endpoints</w:t>
       </w:r>
     </w:p>
     <w:p>
@@ -1859,7 +1891,7 @@
           <w:sz w:val="20"/>
           <w:szCs w:val="20"/>
         </w:rPr>
-        <w:t xml:space="preserve">Production Deployment</w:t>
+        <w:t xml:space="preserve">Production deployment to https://crm.scanwellapps.com</w:t>
       </w:r>
     </w:p>
     <w:p>
@@ -1878,7 +1910,7 @@
           <w:sz w:val="20"/>
           <w:szCs w:val="20"/>
         </w:rPr>
-        <w:t xml:space="preserve">Technical Handover Documentation</w:t>
+        <w:t xml:space="preserve">Post-deployment smoke testing</w:t>
       </w:r>
     </w:p>
     <w:p>
@@ -1897,7 +1929,26 @@
           <w:sz w:val="20"/>
           <w:szCs w:val="20"/>
         </w:rPr>
-        <w:t xml:space="preserve">Final Project Closure Report</w:t>
+        <w:t xml:space="preserve">Handover documentation and knowledge transfer</w:t>
+      </w:r>
+    </w:p>
+    <w:p>
+      <w:pPr>
+        <w:pStyle w:val="ListParagraph"/>
+        <w:numPr>
+          <w:ilvl w:val="0"/>
+          <w:numId w:val="2"/>
+        </w:numPr>
+        <w:spacing w:after="40" w:before="40"/>
+      </w:pPr>
+      <w:r>
+        <w:rPr>
+          <w:rFonts w:ascii="Calibri" w:cs="Calibri" w:eastAsia="Calibri" w:hAnsi="Calibri"/>
+          <w:color w:val="1A1A2E"/>
+          <w:sz w:val="20"/>
+          <w:szCs w:val="20"/>
+        </w:rPr>
+        <w:t xml:space="preserve">Final project sign-off</w:t>
       </w:r>
     </w:p>
     <w:p>
@@ -1913,6 +1964,98 @@
           <w:sz w:val="20"/>
           <w:szCs w:val="20"/>
         </w:rPr>
+        <w:t xml:space="preserve">Deliverables:</w:t>
+      </w:r>
+    </w:p>
+    <w:p>
+      <w:pPr>
+        <w:pStyle w:val="ListParagraph"/>
+        <w:numPr>
+          <w:ilvl w:val="0"/>
+          <w:numId w:val="2"/>
+        </w:numPr>
+        <w:spacing w:after="40" w:before="40"/>
+      </w:pPr>
+      <w:r>
+        <w:rPr>
+          <w:rFonts w:ascii="Calibri" w:cs="Calibri" w:eastAsia="Calibri" w:hAnsi="Calibri"/>
+          <w:color w:val="1A1A2E"/>
+          <w:sz w:val="20"/>
+          <w:szCs w:val="20"/>
+        </w:rPr>
+        <w:t xml:space="preserve">UAT Sign-Off Report</w:t>
+      </w:r>
+    </w:p>
+    <w:p>
+      <w:pPr>
+        <w:pStyle w:val="ListParagraph"/>
+        <w:numPr>
+          <w:ilvl w:val="0"/>
+          <w:numId w:val="2"/>
+        </w:numPr>
+        <w:spacing w:after="40" w:before="40"/>
+      </w:pPr>
+      <w:r>
+        <w:rPr>
+          <w:rFonts w:ascii="Calibri" w:cs="Calibri" w:eastAsia="Calibri" w:hAnsi="Calibri"/>
+          <w:color w:val="1A1A2E"/>
+          <w:sz w:val="20"/>
+          <w:szCs w:val="20"/>
+        </w:rPr>
+        <w:t xml:space="preserve">Production Deployment</w:t>
+      </w:r>
+    </w:p>
+    <w:p>
+      <w:pPr>
+        <w:pStyle w:val="ListParagraph"/>
+        <w:numPr>
+          <w:ilvl w:val="0"/>
+          <w:numId w:val="2"/>
+        </w:numPr>
+        <w:spacing w:after="40" w:before="40"/>
+      </w:pPr>
+      <w:r>
+        <w:rPr>
+          <w:rFonts w:ascii="Calibri" w:cs="Calibri" w:eastAsia="Calibri" w:hAnsi="Calibri"/>
+          <w:color w:val="1A1A2E"/>
+          <w:sz w:val="20"/>
+          <w:szCs w:val="20"/>
+        </w:rPr>
+        <w:t xml:space="preserve">Technical Handover Documentation</w:t>
+      </w:r>
+    </w:p>
+    <w:p>
+      <w:pPr>
+        <w:pStyle w:val="ListParagraph"/>
+        <w:numPr>
+          <w:ilvl w:val="0"/>
+          <w:numId w:val="2"/>
+        </w:numPr>
+        <w:spacing w:after="40" w:before="40"/>
+      </w:pPr>
+      <w:r>
+        <w:rPr>
+          <w:rFonts w:ascii="Calibri" w:cs="Calibri" w:eastAsia="Calibri" w:hAnsi="Calibri"/>
+          <w:color w:val="1A1A2E"/>
+          <w:sz w:val="20"/>
+          <w:szCs w:val="20"/>
+        </w:rPr>
+        <w:t xml:space="preserve">Final Project Closure Report</w:t>
+      </w:r>
+    </w:p>
+    <w:p>
+      <w:pPr>
+        <w:spacing w:after="40" w:before="100"/>
+      </w:pPr>
+      <w:r>
+        <w:rPr>
+          <w:rFonts w:ascii="Calibri" w:cs="Calibri" w:eastAsia="Calibri" w:hAnsi="Calibri"/>
+          <w:b/>
+          <w:bCs/>
+          <w:color w:val="1F4E79"/>
+          <w:sz w:val="20"/>
+          <w:szCs w:val="20"/>
+        </w:rPr>
         <w:t xml:space="preserve">Milestone Review: </w:t>
       </w:r>
       <w:r>
@@ -1924,7 +2067,7 @@
           <w:sz w:val="20"/>
           <w:szCs w:val="20"/>
         </w:rPr>
-        <w:t xml:space="preserve">September 5, 2026 (Final Sign-Off)</w:t>
+        <w:t xml:space="preserve">September 18, 2026 (Final Sign-Off)</w:t>
       </w:r>
     </w:p>
     <w:p>
@@ -2220,7 +2363,7 @@
                 <w:sz w:val="19"/>
                 <w:szCs w:val="19"/>
               </w:rPr>
-              <w:t xml:space="preserve">Technical design finalised, dev environment ready</w:t>
+              <w:t xml:space="preserve">Design finalised, data sources catalogued, dev environment ready</w:t>
             </w:r>
           </w:p>
         </w:tc>
@@ -2255,7 +2398,7 @@
                 <w:sz w:val="19"/>
                 <w:szCs w:val="19"/>
               </w:rPr>
-              <w:t xml:space="preserve">Apr 25, 2026</w:t>
+              <w:t xml:space="preserve">May 15, 2026</w:t>
             </w:r>
           </w:p>
         </w:tc>
@@ -2326,7 +2469,7 @@
                 <w:sz w:val="19"/>
                 <w:szCs w:val="19"/>
               </w:rPr>
-              <w:t xml:space="preserve">Lead Scoring Live</w:t>
+              <w:t xml:space="preserve">Sales Plan AI + Access Report Live</w:t>
             </w:r>
           </w:p>
         </w:tc>
@@ -2361,7 +2504,7 @@
                 <w:sz w:val="19"/>
                 <w:szCs w:val="19"/>
               </w:rPr>
-              <w:t xml:space="preserve">AI scoring integrated into Leads module</w:t>
+              <w:t xml:space="preserve">AI Sales Plan, visit analytics, and User Access report delivered</w:t>
             </w:r>
           </w:p>
         </w:tc>
@@ -2396,7 +2539,7 @@
                 <w:sz w:val="19"/>
                 <w:szCs w:val="19"/>
               </w:rPr>
-              <w:t xml:space="preserve">May 23, 2026</w:t>
+              <w:t xml:space="preserve">Jun 19, 2026</w:t>
             </w:r>
           </w:p>
         </w:tc>
@@ -2467,7 +2610,7 @@
                 <w:sz w:val="19"/>
                 <w:szCs w:val="19"/>
               </w:rPr>
-              <w:t xml:space="preserve">Quote &amp; Document AI Live</w:t>
+              <w:t xml:space="preserve">Quote Options &amp; Rates Lookup Live</w:t>
             </w:r>
           </w:p>
         </w:tc>
@@ -2502,7 +2645,7 @@
                 <w:sz w:val="19"/>
                 <w:szCs w:val="19"/>
               </w:rPr>
-              <w:t xml:space="preserve">Recommendation engine and smart generation deployed</w:t>
+              <w:t xml:space="preserve">AI Quote Options panel and location-based Rates lookup delivered</w:t>
             </w:r>
           </w:p>
         </w:tc>
@@ -2537,7 +2680,7 @@
                 <w:sz w:val="19"/>
                 <w:szCs w:val="19"/>
               </w:rPr>
-              <w:t xml:space="preserve">Jun 27, 2026</w:t>
+              <w:t xml:space="preserve">Jul 17, 2026</w:t>
             </w:r>
           </w:p>
         </w:tc>
@@ -2608,7 +2751,7 @@
                 <w:sz w:val="19"/>
                 <w:szCs w:val="19"/>
               </w:rPr>
-              <w:t xml:space="preserve">Forecasting &amp; Assistant Live</w:t>
+              <w:t xml:space="preserve">Shipping Routes &amp; Regulations Live</w:t>
             </w:r>
           </w:p>
         </w:tc>
@@ -2643,7 +2786,7 @@
                 <w:sz w:val="19"/>
                 <w:szCs w:val="19"/>
               </w:rPr>
-              <w:t xml:space="preserve">Sales dashboard and AI Assistant deployed</w:t>
+              <w:t xml:space="preserve">Shipping Route Management and Commodity Regulation modules delivered</w:t>
             </w:r>
           </w:p>
         </w:tc>
@@ -2678,7 +2821,7 @@
                 <w:sz w:val="19"/>
                 <w:szCs w:val="19"/>
               </w:rPr>
-              <w:t xml:space="preserve">Aug 8, 2026</w:t>
+              <w:t xml:space="preserve">Aug 28, 2026</w:t>
             </w:r>
           </w:p>
         </w:tc>
@@ -2819,7 +2962,7 @@
                 <w:sz w:val="19"/>
                 <w:szCs w:val="19"/>
               </w:rPr>
-              <w:t xml:space="preserve">Sep 5, 2026</w:t>
+              <w:t xml:space="preserve">Sep 18, 2026</w:t>
             </w:r>
           </w:p>
         </w:tc>
@@ -2871,8 +3014,8 @@
       </w:tblPr>
       <w:tblGrid>
         <w:gridCol w:w="1200"/>
-        <w:gridCol w:w="3080"/>
-        <w:gridCol w:w="5800"/>
+        <w:gridCol w:w="3400"/>
+        <w:gridCol w:w="5480"/>
       </w:tblGrid>
       <w:tr>
         <w:tc>
@@ -2912,7 +3055,7 @@
         </w:tc>
         <w:tc>
           <w:tcPr>
-            <w:tcW w:type="dxa" w:w="3080"/>
+            <w:tcW w:type="dxa" w:w="3400"/>
             <w:tcBorders>
               <w:top w:val="single" w:color="CCCCCC" w:sz="1"/>
               <w:left w:val="single" w:color="CCCCCC" w:sz="1"/>
@@ -2947,7 +3090,7 @@
         </w:tc>
         <w:tc>
           <w:tcPr>
-            <w:tcW w:type="dxa" w:w="5800"/>
+            <w:tcW w:type="dxa" w:w="5480"/>
             <w:tcBorders>
               <w:top w:val="single" w:color="CCCCCC" w:sz="1"/>
               <w:left w:val="single" w:color="CCCCCC" w:sz="1"/>
@@ -3019,7 +3162,7 @@
         </w:tc>
         <w:tc>
           <w:tcPr>
-            <w:tcW w:type="dxa" w:w="3080"/>
+            <w:tcW w:type="dxa" w:w="3400"/>
             <w:tcBorders>
               <w:top w:val="single" w:color="CCCCCC" w:sz="1"/>
               <w:left w:val="single" w:color="CCCCCC" w:sz="1"/>
@@ -3054,7 +3197,7 @@
         </w:tc>
         <w:tc>
           <w:tcPr>
-            <w:tcW w:type="dxa" w:w="5800"/>
+            <w:tcW w:type="dxa" w:w="5480"/>
             <w:tcBorders>
               <w:top w:val="single" w:color="CCCCCC" w:sz="1"/>
               <w:left w:val="single" w:color="CCCCCC" w:sz="1"/>
@@ -3083,7 +3226,7 @@
                 <w:sz w:val="19"/>
                 <w:szCs w:val="19"/>
               </w:rPr>
-              <w:t xml:space="preserve">Audit, design, environment setup</w:t>
+              <w:t xml:space="preserve">Audit, design, data source catalogue, env setup</w:t>
             </w:r>
           </w:p>
         </w:tc>
@@ -3126,7 +3269,7 @@
         </w:tc>
         <w:tc>
           <w:tcPr>
-            <w:tcW w:type="dxa" w:w="3080"/>
+            <w:tcW w:type="dxa" w:w="3400"/>
             <w:tcBorders>
               <w:top w:val="single" w:color="CCCCCC" w:sz="1"/>
               <w:left w:val="single" w:color="CCCCCC" w:sz="1"/>
@@ -3161,7 +3304,7 @@
         </w:tc>
         <w:tc>
           <w:tcPr>
-            <w:tcW w:type="dxa" w:w="5800"/>
+            <w:tcW w:type="dxa" w:w="5480"/>
             <w:tcBorders>
               <w:top w:val="single" w:color="CCCCCC" w:sz="1"/>
               <w:left w:val="single" w:color="CCCCCC" w:sz="1"/>
@@ -3190,7 +3333,7 @@
                 <w:sz w:val="19"/>
                 <w:szCs w:val="19"/>
               </w:rPr>
-              <w:t xml:space="preserve">AI service layer, backend integration</w:t>
+              <w:t xml:space="preserve">Sales Plan map, radius lookup, visit analytics</w:t>
             </w:r>
           </w:p>
         </w:tc>
@@ -3233,7 +3376,7 @@
         </w:tc>
         <w:tc>
           <w:tcPr>
-            <w:tcW w:type="dxa" w:w="3080"/>
+            <w:tcW w:type="dxa" w:w="3400"/>
             <w:tcBorders>
               <w:top w:val="single" w:color="CCCCCC" w:sz="1"/>
               <w:left w:val="single" w:color="CCCCCC" w:sz="1"/>
@@ -3268,7 +3411,7 @@
         </w:tc>
         <w:tc>
           <w:tcPr>
-            <w:tcW w:type="dxa" w:w="5800"/>
+            <w:tcW w:type="dxa" w:w="5480"/>
             <w:tcBorders>
               <w:top w:val="single" w:color="CCCCCC" w:sz="1"/>
               <w:left w:val="single" w:color="CCCCCC" w:sz="1"/>
@@ -3297,7 +3440,7 @@
                 <w:sz w:val="19"/>
                 <w:szCs w:val="19"/>
               </w:rPr>
-              <w:t xml:space="preserve">Lead scoring engine, frontend integration</w:t>
+              <w:t xml:space="preserve">AI reason summaries, Importers/Exporters view</w:t>
             </w:r>
           </w:p>
         </w:tc>
@@ -3334,13 +3477,13 @@
                 <w:sz w:val="19"/>
                 <w:szCs w:val="19"/>
               </w:rPr>
-              <w:t xml:space="preserve">7–8</w:t>
-            </w:r>
-          </w:p>
-        </w:tc>
-        <w:tc>
-          <w:tcPr>
-            <w:tcW w:type="dxa" w:w="3080"/>
+              <w:t xml:space="preserve">7</w:t>
+            </w:r>
+          </w:p>
+        </w:tc>
+        <w:tc>
+          <w:tcPr>
+            <w:tcW w:type="dxa" w:w="3400"/>
             <w:tcBorders>
               <w:top w:val="single" w:color="CCCCCC" w:sz="1"/>
               <w:left w:val="single" w:color="CCCCCC" w:sz="1"/>
@@ -3369,13 +3512,13 @@
                 <w:sz w:val="19"/>
                 <w:szCs w:val="19"/>
               </w:rPr>
-              <w:t xml:space="preserve">Phase 3</w:t>
-            </w:r>
-          </w:p>
-        </w:tc>
-        <w:tc>
-          <w:tcPr>
-            <w:tcW w:type="dxa" w:w="5800"/>
+              <w:t xml:space="preserve">Phase 2</w:t>
+            </w:r>
+          </w:p>
+        </w:tc>
+        <w:tc>
+          <w:tcPr>
+            <w:tcW w:type="dxa" w:w="5480"/>
             <w:tcBorders>
               <w:top w:val="single" w:color="CCCCCC" w:sz="1"/>
               <w:left w:val="single" w:color="CCCCCC" w:sz="1"/>
@@ -3404,7 +3547,7 @@
                 <w:sz w:val="19"/>
                 <w:szCs w:val="19"/>
               </w:rPr>
-              <w:t xml:space="preserve">Rate analysis engine, quote recommendation</w:t>
+              <w:t xml:space="preserve">User Last System Access report, Phase 2 testing</w:t>
             </w:r>
           </w:p>
         </w:tc>
@@ -3441,13 +3584,13 @@
                 <w:sz w:val="19"/>
                 <w:szCs w:val="19"/>
               </w:rPr>
-              <w:t xml:space="preserve">9–10</w:t>
-            </w:r>
-          </w:p>
-        </w:tc>
-        <w:tc>
-          <w:tcPr>
-            <w:tcW w:type="dxa" w:w="3080"/>
+              <w:t xml:space="preserve">8–9</w:t>
+            </w:r>
+          </w:p>
+        </w:tc>
+        <w:tc>
+          <w:tcPr>
+            <w:tcW w:type="dxa" w:w="3400"/>
             <w:tcBorders>
               <w:top w:val="single" w:color="CCCCCC" w:sz="1"/>
               <w:left w:val="single" w:color="CCCCCC" w:sz="1"/>
@@ -3482,7 +3625,7 @@
         </w:tc>
         <w:tc>
           <w:tcPr>
-            <w:tcW w:type="dxa" w:w="5800"/>
+            <w:tcW w:type="dxa" w:w="5480"/>
             <w:tcBorders>
               <w:top w:val="single" w:color="CCCCCC" w:sz="1"/>
               <w:left w:val="single" w:color="CCCCCC" w:sz="1"/>
@@ -3511,7 +3654,7 @@
                 <w:sz w:val="19"/>
                 <w:szCs w:val="19"/>
               </w:rPr>
-              <w:t xml:space="preserve">Smart document generation</w:t>
+              <w:t xml:space="preserve">Quote Options AI panel across all quote modes</w:t>
             </w:r>
           </w:p>
         </w:tc>
@@ -3548,13 +3691,13 @@
                 <w:sz w:val="19"/>
                 <w:szCs w:val="19"/>
               </w:rPr>
-              <w:t xml:space="preserve">11</w:t>
-            </w:r>
-          </w:p>
-        </w:tc>
-        <w:tc>
-          <w:tcPr>
-            <w:tcW w:type="dxa" w:w="3080"/>
+              <w:t xml:space="preserve">10–11</w:t>
+            </w:r>
+          </w:p>
+        </w:tc>
+        <w:tc>
+          <w:tcPr>
+            <w:tcW w:type="dxa" w:w="3400"/>
             <w:tcBorders>
               <w:top w:val="single" w:color="CCCCCC" w:sz="1"/>
               <w:left w:val="single" w:color="CCCCCC" w:sz="1"/>
@@ -3589,7 +3732,7 @@
         </w:tc>
         <w:tc>
           <w:tcPr>
-            <w:tcW w:type="dxa" w:w="5800"/>
+            <w:tcW w:type="dxa" w:w="5480"/>
             <w:tcBorders>
               <w:top w:val="single" w:color="CCCCCC" w:sz="1"/>
               <w:left w:val="single" w:color="CCCCCC" w:sz="1"/>
@@ -3618,7 +3761,7 @@
                 <w:sz w:val="19"/>
                 <w:szCs w:val="19"/>
               </w:rPr>
-              <w:t xml:space="preserve">Integration testing, bug fixes</w:t>
+              <w:t xml:space="preserve">Location-based Rates lookup, trend view, testing</w:t>
             </w:r>
           </w:p>
         </w:tc>
@@ -3655,13 +3798,13 @@
                 <w:sz w:val="19"/>
                 <w:szCs w:val="19"/>
               </w:rPr>
-              <w:t xml:space="preserve">12–13</w:t>
-            </w:r>
-          </w:p>
-        </w:tc>
-        <w:tc>
-          <w:tcPr>
-            <w:tcW w:type="dxa" w:w="3080"/>
+              <w:t xml:space="preserve">12–14</w:t>
+            </w:r>
+          </w:p>
+        </w:tc>
+        <w:tc>
+          <w:tcPr>
+            <w:tcW w:type="dxa" w:w="3400"/>
             <w:tcBorders>
               <w:top w:val="single" w:color="CCCCCC" w:sz="1"/>
               <w:left w:val="single" w:color="CCCCCC" w:sz="1"/>
@@ -3696,7 +3839,7 @@
         </w:tc>
         <w:tc>
           <w:tcPr>
-            <w:tcW w:type="dxa" w:w="5800"/>
+            <w:tcW w:type="dxa" w:w="5480"/>
             <w:tcBorders>
               <w:top w:val="single" w:color="CCCCCC" w:sz="1"/>
               <w:left w:val="single" w:color="CCCCCC" w:sz="1"/>
@@ -3725,7 +3868,7 @@
                 <w:sz w:val="19"/>
                 <w:szCs w:val="19"/>
               </w:rPr>
-              <w:t xml:space="preserve">Forecasting model, dashboard development</w:t>
+              <w:t xml:space="preserve">Shipping Route Management + liner extraction</w:t>
             </w:r>
           </w:p>
         </w:tc>
@@ -3762,13 +3905,13 @@
                 <w:sz w:val="19"/>
                 <w:szCs w:val="19"/>
               </w:rPr>
-              <w:t xml:space="preserve">14–15</w:t>
-            </w:r>
-          </w:p>
-        </w:tc>
-        <w:tc>
-          <w:tcPr>
-            <w:tcW w:type="dxa" w:w="3080"/>
+              <w:t xml:space="preserve">15–16</w:t>
+            </w:r>
+          </w:p>
+        </w:tc>
+        <w:tc>
+          <w:tcPr>
+            <w:tcW w:type="dxa" w:w="3400"/>
             <w:tcBorders>
               <w:top w:val="single" w:color="CCCCCC" w:sz="1"/>
               <w:left w:val="single" w:color="CCCCCC" w:sz="1"/>
@@ -3803,7 +3946,7 @@
         </w:tc>
         <w:tc>
           <w:tcPr>
-            <w:tcW w:type="dxa" w:w="5800"/>
+            <w:tcW w:type="dxa" w:w="5480"/>
             <w:tcBorders>
               <w:top w:val="single" w:color="CCCCCC" w:sz="1"/>
               <w:left w:val="single" w:color="CCCCCC" w:sz="1"/>
@@ -3832,7 +3975,7 @@
                 <w:sz w:val="19"/>
                 <w:szCs w:val="19"/>
               </w:rPr>
-              <w:t xml:space="preserve">AI Assistant backend (query resolution)</w:t>
+              <w:t xml:space="preserve">Commodity Regulation lookup + customs sourcing</w:t>
             </w:r>
           </w:p>
         </w:tc>
@@ -3869,13 +4012,13 @@
                 <w:sz w:val="19"/>
                 <w:szCs w:val="19"/>
               </w:rPr>
-              <w:t xml:space="preserve">16–17</w:t>
-            </w:r>
-          </w:p>
-        </w:tc>
-        <w:tc>
-          <w:tcPr>
-            <w:tcW w:type="dxa" w:w="3080"/>
+              <w:t xml:space="preserve">17</w:t>
+            </w:r>
+          </w:p>
+        </w:tc>
+        <w:tc>
+          <w:tcPr>
+            <w:tcW w:type="dxa" w:w="3400"/>
             <w:tcBorders>
               <w:top w:val="single" w:color="CCCCCC" w:sz="1"/>
               <w:left w:val="single" w:color="CCCCCC" w:sz="1"/>
@@ -3910,7 +4053,7 @@
         </w:tc>
         <w:tc>
           <w:tcPr>
-            <w:tcW w:type="dxa" w:w="5800"/>
+            <w:tcW w:type="dxa" w:w="5480"/>
             <w:tcBorders>
               <w:top w:val="single" w:color="CCCCCC" w:sz="1"/>
               <w:left w:val="single" w:color="CCCCCC" w:sz="1"/>
@@ -3939,7 +4082,7 @@
                 <w:sz w:val="19"/>
                 <w:szCs w:val="19"/>
               </w:rPr>
-              <w:t xml:space="preserve">AI Assistant frontend, full integration testing</w:t>
+              <w:t xml:space="preserve">End-to-end integration testing</w:t>
             </w:r>
           </w:p>
         </w:tc>
@@ -3982,7 +4125,7 @@
         </w:tc>
         <w:tc>
           <w:tcPr>
-            <w:tcW w:type="dxa" w:w="3080"/>
+            <w:tcW w:type="dxa" w:w="3400"/>
             <w:tcBorders>
               <w:top w:val="single" w:color="CCCCCC" w:sz="1"/>
               <w:left w:val="single" w:color="CCCCCC" w:sz="1"/>
@@ -4017,7 +4160,7 @@
         </w:tc>
         <w:tc>
           <w:tcPr>
-            <w:tcW w:type="dxa" w:w="5800"/>
+            <w:tcW w:type="dxa" w:w="5480"/>
             <w:tcBorders>
               <w:top w:val="single" w:color="CCCCCC" w:sz="1"/>
               <w:left w:val="single" w:color="CCCCCC" w:sz="1"/>
@@ -4089,7 +4232,7 @@
         </w:tc>
         <w:tc>
           <w:tcPr>
-            <w:tcW w:type="dxa" w:w="3080"/>
+            <w:tcW w:type="dxa" w:w="3400"/>
             <w:tcBorders>
               <w:top w:val="single" w:color="CCCCCC" w:sz="1"/>
               <w:left w:val="single" w:color="CCCCCC" w:sz="1"/>
@@ -4124,7 +4267,7 @@
         </w:tc>
         <w:tc>
           <w:tcPr>
-            <w:tcW w:type="dxa" w:w="5800"/>
+            <w:tcW w:type="dxa" w:w="5480"/>
             <w:tcBorders>
               <w:top w:val="single" w:color="CCCCCC" w:sz="1"/>
               <w:left w:val="single" w:color="CCCCCC" w:sz="1"/>
@@ -4383,7 +4526,149 @@
                 <w:sz w:val="19"/>
                 <w:szCs w:val="19"/>
               </w:rPr>
-              <w:t xml:space="preserve">Insufficient historical data for lead scoring model</w:t>
+              <w:t xml:space="preserve">Liner portals change structure or block scraping</w:t>
+            </w:r>
+          </w:p>
+        </w:tc>
+        <w:tc>
+          <w:tcPr>
+            <w:tcW w:type="dxa" w:w="1200"/>
+            <w:tcBorders>
+              <w:top w:val="single" w:color="CCCCCC" w:sz="1"/>
+              <w:left w:val="single" w:color="CCCCCC" w:sz="1"/>
+              <w:bottom w:val="single" w:color="CCCCCC" w:sz="1"/>
+              <w:right w:val="single" w:color="CCCCCC" w:sz="1"/>
+            </w:tcBorders>
+            <w:shd w:fill="FCE4D6" w:val="clear"/>
+            <w:tcMar>
+              <w:top w:type="dxa" w:w="90"/>
+              <w:left w:type="dxa" w:w="130"/>
+              <w:bottom w:type="dxa" w:w="90"/>
+              <w:right w:type="dxa" w:w="130"/>
+            </w:tcMar>
+            <w:vAlign w:val="center"/>
+          </w:tcPr>
+          <w:p>
+            <w:pPr>
+              <w:jc w:val="center"/>
+            </w:pPr>
+            <w:r>
+              <w:rPr>
+                <w:rFonts w:ascii="Calibri" w:cs="Calibri" w:eastAsia="Calibri" w:hAnsi="Calibri"/>
+                <w:b/>
+                <w:bCs/>
+                <w:color w:val="8B1A1A"/>
+                <w:sz w:val="19"/>
+                <w:szCs w:val="19"/>
+              </w:rPr>
+              <w:t xml:space="preserve">High</w:t>
+            </w:r>
+          </w:p>
+        </w:tc>
+        <w:tc>
+          <w:tcPr>
+            <w:tcW w:type="dxa" w:w="1200"/>
+            <w:tcBorders>
+              <w:top w:val="single" w:color="CCCCCC" w:sz="1"/>
+              <w:left w:val="single" w:color="CCCCCC" w:sz="1"/>
+              <w:bottom w:val="single" w:color="CCCCCC" w:sz="1"/>
+              <w:right w:val="single" w:color="CCCCCC" w:sz="1"/>
+            </w:tcBorders>
+            <w:shd w:fill="FCE4D6" w:val="clear"/>
+            <w:tcMar>
+              <w:top w:type="dxa" w:w="90"/>
+              <w:left w:type="dxa" w:w="130"/>
+              <w:bottom w:type="dxa" w:w="90"/>
+              <w:right w:type="dxa" w:w="130"/>
+            </w:tcMar>
+            <w:vAlign w:val="center"/>
+          </w:tcPr>
+          <w:p>
+            <w:pPr>
+              <w:jc w:val="center"/>
+            </w:pPr>
+            <w:r>
+              <w:rPr>
+                <w:rFonts w:ascii="Calibri" w:cs="Calibri" w:eastAsia="Calibri" w:hAnsi="Calibri"/>
+                <w:b/>
+                <w:bCs/>
+                <w:color w:val="8B1A1A"/>
+                <w:sz w:val="19"/>
+                <w:szCs w:val="19"/>
+              </w:rPr>
+              <w:t xml:space="preserve">High</w:t>
+            </w:r>
+          </w:p>
+        </w:tc>
+        <w:tc>
+          <w:tcPr>
+            <w:tcW w:type="dxa" w:w="4180"/>
+            <w:tcBorders>
+              <w:top w:val="single" w:color="CCCCCC" w:sz="1"/>
+              <w:left w:val="single" w:color="CCCCCC" w:sz="1"/>
+              <w:bottom w:val="single" w:color="CCCCCC" w:sz="1"/>
+              <w:right w:val="single" w:color="CCCCCC" w:sz="1"/>
+            </w:tcBorders>
+            <w:shd w:fill="FFFFFF" w:val="clear"/>
+            <w:tcMar>
+              <w:top w:type="dxa" w:w="90"/>
+              <w:left w:type="dxa" w:w="130"/>
+              <w:bottom w:type="dxa" w:w="90"/>
+              <w:right w:type="dxa" w:w="130"/>
+            </w:tcMar>
+            <w:vAlign w:val="center"/>
+          </w:tcPr>
+          <w:p>
+            <w:pPr>
+              <w:jc w:val="left"/>
+            </w:pPr>
+            <w:r>
+              <w:rPr>
+                <w:rFonts w:ascii="Calibri" w:cs="Calibri" w:eastAsia="Calibri" w:hAnsi="Calibri"/>
+                <w:b w:val="false"/>
+                <w:bCs w:val="false"/>
+                <w:color w:val="1A1A2E"/>
+                <w:sz w:val="19"/>
+                <w:szCs w:val="19"/>
+              </w:rPr>
+              <w:t xml:space="preserve">Design modular extractors; support multiple liners; manual fallback upload</w:t>
+            </w:r>
+          </w:p>
+        </w:tc>
+      </w:tr>
+      <w:tr>
+        <w:tc>
+          <w:tcPr>
+            <w:tcW w:type="dxa" w:w="3500"/>
+            <w:tcBorders>
+              <w:top w:val="single" w:color="CCCCCC" w:sz="1"/>
+              <w:left w:val="single" w:color="CCCCCC" w:sz="1"/>
+              <w:bottom w:val="single" w:color="CCCCCC" w:sz="1"/>
+              <w:right w:val="single" w:color="CCCCCC" w:sz="1"/>
+            </w:tcBorders>
+            <w:shd w:fill="EBF3FB" w:val="clear"/>
+            <w:tcMar>
+              <w:top w:type="dxa" w:w="90"/>
+              <w:left w:type="dxa" w:w="130"/>
+              <w:bottom w:type="dxa" w:w="90"/>
+              <w:right w:type="dxa" w:w="130"/>
+            </w:tcMar>
+            <w:vAlign w:val="center"/>
+          </w:tcPr>
+          <w:p>
+            <w:pPr>
+              <w:jc w:val="left"/>
+            </w:pPr>
+            <w:r>
+              <w:rPr>
+                <w:rFonts w:ascii="Calibri" w:cs="Calibri" w:eastAsia="Calibri" w:hAnsi="Calibri"/>
+                <w:b w:val="false"/>
+                <w:bCs w:val="false"/>
+                <w:color w:val="1A1A2E"/>
+                <w:sz w:val="19"/>
+                <w:szCs w:val="19"/>
+              </w:rPr>
+              <w:t xml:space="preserve">Customs site data for some HS Codes/countries is sparse</w:t>
             </w:r>
           </w:p>
         </w:tc>
@@ -4431,6 +4716,290 @@
               <w:bottom w:val="single" w:color="CCCCCC" w:sz="1"/>
               <w:right w:val="single" w:color="CCCCCC" w:sz="1"/>
             </w:tcBorders>
+            <w:shd w:fill="FFF2CC" w:val="clear"/>
+            <w:tcMar>
+              <w:top w:type="dxa" w:w="90"/>
+              <w:left w:type="dxa" w:w="130"/>
+              <w:bottom w:type="dxa" w:w="90"/>
+              <w:right w:type="dxa" w:w="130"/>
+            </w:tcMar>
+            <w:vAlign w:val="center"/>
+          </w:tcPr>
+          <w:p>
+            <w:pPr>
+              <w:jc w:val="center"/>
+            </w:pPr>
+            <w:r>
+              <w:rPr>
+                <w:rFonts w:ascii="Calibri" w:cs="Calibri" w:eastAsia="Calibri" w:hAnsi="Calibri"/>
+                <w:b/>
+                <w:bCs/>
+                <w:color w:val="7B5E00"/>
+                <w:sz w:val="19"/>
+                <w:szCs w:val="19"/>
+              </w:rPr>
+              <w:t xml:space="preserve">Medium</w:t>
+            </w:r>
+          </w:p>
+        </w:tc>
+        <w:tc>
+          <w:tcPr>
+            <w:tcW w:type="dxa" w:w="4180"/>
+            <w:tcBorders>
+              <w:top w:val="single" w:color="CCCCCC" w:sz="1"/>
+              <w:left w:val="single" w:color="CCCCCC" w:sz="1"/>
+              <w:bottom w:val="single" w:color="CCCCCC" w:sz="1"/>
+              <w:right w:val="single" w:color="CCCCCC" w:sz="1"/>
+            </w:tcBorders>
+            <w:shd w:fill="EBF3FB" w:val="clear"/>
+            <w:tcMar>
+              <w:top w:type="dxa" w:w="90"/>
+              <w:left w:type="dxa" w:w="130"/>
+              <w:bottom w:type="dxa" w:w="90"/>
+              <w:right w:type="dxa" w:w="130"/>
+            </w:tcMar>
+            <w:vAlign w:val="center"/>
+          </w:tcPr>
+          <w:p>
+            <w:pPr>
+              <w:jc w:val="left"/>
+            </w:pPr>
+            <w:r>
+              <w:rPr>
+                <w:rFonts w:ascii="Calibri" w:cs="Calibri" w:eastAsia="Calibri" w:hAnsi="Calibri"/>
+                <w:b w:val="false"/>
+                <w:bCs w:val="false"/>
+                <w:color w:val="1A1A2E"/>
+                <w:sz w:val="19"/>
+                <w:szCs w:val="19"/>
+              </w:rPr>
+              <w:t xml:space="preserve">Clearly flag “no data” cases; always show source links for verification</w:t>
+            </w:r>
+          </w:p>
+        </w:tc>
+      </w:tr>
+      <w:tr>
+        <w:tc>
+          <w:tcPr>
+            <w:tcW w:type="dxa" w:w="3500"/>
+            <w:tcBorders>
+              <w:top w:val="single" w:color="CCCCCC" w:sz="1"/>
+              <w:left w:val="single" w:color="CCCCCC" w:sz="1"/>
+              <w:bottom w:val="single" w:color="CCCCCC" w:sz="1"/>
+              <w:right w:val="single" w:color="CCCCCC" w:sz="1"/>
+            </w:tcBorders>
+            <w:shd w:fill="FFFFFF" w:val="clear"/>
+            <w:tcMar>
+              <w:top w:type="dxa" w:w="90"/>
+              <w:left w:type="dxa" w:w="130"/>
+              <w:bottom w:type="dxa" w:w="90"/>
+              <w:right w:type="dxa" w:w="130"/>
+            </w:tcMar>
+            <w:vAlign w:val="center"/>
+          </w:tcPr>
+          <w:p>
+            <w:pPr>
+              <w:jc w:val="left"/>
+            </w:pPr>
+            <w:r>
+              <w:rPr>
+                <w:rFonts w:ascii="Calibri" w:cs="Calibri" w:eastAsia="Calibri" w:hAnsi="Calibri"/>
+                <w:b w:val="false"/>
+                <w:bCs w:val="false"/>
+                <w:color w:val="1A1A2E"/>
+                <w:sz w:val="19"/>
+                <w:szCs w:val="19"/>
+              </w:rPr>
+              <w:t xml:space="preserve">Claude API rate limits during peak usage</w:t>
+            </w:r>
+          </w:p>
+        </w:tc>
+        <w:tc>
+          <w:tcPr>
+            <w:tcW w:type="dxa" w:w="1200"/>
+            <w:tcBorders>
+              <w:top w:val="single" w:color="CCCCCC" w:sz="1"/>
+              <w:left w:val="single" w:color="CCCCCC" w:sz="1"/>
+              <w:bottom w:val="single" w:color="CCCCCC" w:sz="1"/>
+              <w:right w:val="single" w:color="CCCCCC" w:sz="1"/>
+            </w:tcBorders>
+            <w:shd w:fill="E2EFDA" w:val="clear"/>
+            <w:tcMar>
+              <w:top w:type="dxa" w:w="90"/>
+              <w:left w:type="dxa" w:w="130"/>
+              <w:bottom w:type="dxa" w:w="90"/>
+              <w:right w:type="dxa" w:w="130"/>
+            </w:tcMar>
+            <w:vAlign w:val="center"/>
+          </w:tcPr>
+          <w:p>
+            <w:pPr>
+              <w:jc w:val="center"/>
+            </w:pPr>
+            <w:r>
+              <w:rPr>
+                <w:rFonts w:ascii="Calibri" w:cs="Calibri" w:eastAsia="Calibri" w:hAnsi="Calibri"/>
+                <w:b/>
+                <w:bCs/>
+                <w:color w:val="1E7145"/>
+                <w:sz w:val="19"/>
+                <w:szCs w:val="19"/>
+              </w:rPr>
+              <w:t xml:space="preserve">Low</w:t>
+            </w:r>
+          </w:p>
+        </w:tc>
+        <w:tc>
+          <w:tcPr>
+            <w:tcW w:type="dxa" w:w="1200"/>
+            <w:tcBorders>
+              <w:top w:val="single" w:color="CCCCCC" w:sz="1"/>
+              <w:left w:val="single" w:color="CCCCCC" w:sz="1"/>
+              <w:bottom w:val="single" w:color="CCCCCC" w:sz="1"/>
+              <w:right w:val="single" w:color="CCCCCC" w:sz="1"/>
+            </w:tcBorders>
+            <w:shd w:fill="FFF2CC" w:val="clear"/>
+            <w:tcMar>
+              <w:top w:type="dxa" w:w="90"/>
+              <w:left w:type="dxa" w:w="130"/>
+              <w:bottom w:type="dxa" w:w="90"/>
+              <w:right w:type="dxa" w:w="130"/>
+            </w:tcMar>
+            <w:vAlign w:val="center"/>
+          </w:tcPr>
+          <w:p>
+            <w:pPr>
+              <w:jc w:val="center"/>
+            </w:pPr>
+            <w:r>
+              <w:rPr>
+                <w:rFonts w:ascii="Calibri" w:cs="Calibri" w:eastAsia="Calibri" w:hAnsi="Calibri"/>
+                <w:b/>
+                <w:bCs/>
+                <w:color w:val="7B5E00"/>
+                <w:sz w:val="19"/>
+                <w:szCs w:val="19"/>
+              </w:rPr>
+              <w:t xml:space="preserve">Medium</w:t>
+            </w:r>
+          </w:p>
+        </w:tc>
+        <w:tc>
+          <w:tcPr>
+            <w:tcW w:type="dxa" w:w="4180"/>
+            <w:tcBorders>
+              <w:top w:val="single" w:color="CCCCCC" w:sz="1"/>
+              <w:left w:val="single" w:color="CCCCCC" w:sz="1"/>
+              <w:bottom w:val="single" w:color="CCCCCC" w:sz="1"/>
+              <w:right w:val="single" w:color="CCCCCC" w:sz="1"/>
+            </w:tcBorders>
+            <w:shd w:fill="FFFFFF" w:val="clear"/>
+            <w:tcMar>
+              <w:top w:type="dxa" w:w="90"/>
+              <w:left w:type="dxa" w:w="130"/>
+              <w:bottom w:type="dxa" w:w="90"/>
+              <w:right w:type="dxa" w:w="130"/>
+            </w:tcMar>
+            <w:vAlign w:val="center"/>
+          </w:tcPr>
+          <w:p>
+            <w:pPr>
+              <w:jc w:val="left"/>
+            </w:pPr>
+            <w:r>
+              <w:rPr>
+                <w:rFonts w:ascii="Calibri" w:cs="Calibri" w:eastAsia="Calibri" w:hAnsi="Calibri"/>
+                <w:b w:val="false"/>
+                <w:bCs w:val="false"/>
+                <w:color w:val="1A1A2E"/>
+                <w:sz w:val="19"/>
+                <w:szCs w:val="19"/>
+              </w:rPr>
+              <w:t xml:space="preserve">Implement request queuing and response caching</w:t>
+            </w:r>
+          </w:p>
+        </w:tc>
+      </w:tr>
+      <w:tr>
+        <w:tc>
+          <w:tcPr>
+            <w:tcW w:type="dxa" w:w="3500"/>
+            <w:tcBorders>
+              <w:top w:val="single" w:color="CCCCCC" w:sz="1"/>
+              <w:left w:val="single" w:color="CCCCCC" w:sz="1"/>
+              <w:bottom w:val="single" w:color="CCCCCC" w:sz="1"/>
+              <w:right w:val="single" w:color="CCCCCC" w:sz="1"/>
+            </w:tcBorders>
+            <w:shd w:fill="EBF3FB" w:val="clear"/>
+            <w:tcMar>
+              <w:top w:type="dxa" w:w="90"/>
+              <w:left w:type="dxa" w:w="130"/>
+              <w:bottom w:type="dxa" w:w="90"/>
+              <w:right w:type="dxa" w:w="130"/>
+            </w:tcMar>
+            <w:vAlign w:val="center"/>
+          </w:tcPr>
+          <w:p>
+            <w:pPr>
+              <w:jc w:val="left"/>
+            </w:pPr>
+            <w:r>
+              <w:rPr>
+                <w:rFonts w:ascii="Calibri" w:cs="Calibri" w:eastAsia="Calibri" w:hAnsi="Calibri"/>
+                <w:b w:val="false"/>
+                <w:bCs w:val="false"/>
+                <w:color w:val="1A1A2E"/>
+                <w:sz w:val="19"/>
+                <w:szCs w:val="19"/>
+              </w:rPr>
+              <w:t xml:space="preserve">Scope creep from additional stakeholder requests</w:t>
+            </w:r>
+          </w:p>
+        </w:tc>
+        <w:tc>
+          <w:tcPr>
+            <w:tcW w:type="dxa" w:w="1200"/>
+            <w:tcBorders>
+              <w:top w:val="single" w:color="CCCCCC" w:sz="1"/>
+              <w:left w:val="single" w:color="CCCCCC" w:sz="1"/>
+              <w:bottom w:val="single" w:color="CCCCCC" w:sz="1"/>
+              <w:right w:val="single" w:color="CCCCCC" w:sz="1"/>
+            </w:tcBorders>
+            <w:shd w:fill="FFF2CC" w:val="clear"/>
+            <w:tcMar>
+              <w:top w:type="dxa" w:w="90"/>
+              <w:left w:type="dxa" w:w="130"/>
+              <w:bottom w:type="dxa" w:w="90"/>
+              <w:right w:type="dxa" w:w="130"/>
+            </w:tcMar>
+            <w:vAlign w:val="center"/>
+          </w:tcPr>
+          <w:p>
+            <w:pPr>
+              <w:jc w:val="center"/>
+            </w:pPr>
+            <w:r>
+              <w:rPr>
+                <w:rFonts w:ascii="Calibri" w:cs="Calibri" w:eastAsia="Calibri" w:hAnsi="Calibri"/>
+                <w:b/>
+                <w:bCs/>
+                <w:color w:val="7B5E00"/>
+                <w:sz w:val="19"/>
+                <w:szCs w:val="19"/>
+              </w:rPr>
+              <w:t xml:space="preserve">Medium</w:t>
+            </w:r>
+          </w:p>
+        </w:tc>
+        <w:tc>
+          <w:tcPr>
+            <w:tcW w:type="dxa" w:w="1200"/>
+            <w:tcBorders>
+              <w:top w:val="single" w:color="CCCCCC" w:sz="1"/>
+              <w:left w:val="single" w:color="CCCCCC" w:sz="1"/>
+              <w:bottom w:val="single" w:color="CCCCCC" w:sz="1"/>
+              <w:right w:val="single" w:color="CCCCCC" w:sz="1"/>
+            </w:tcBorders>
             <w:shd w:fill="FCE4D6" w:val="clear"/>
             <w:tcMar>
               <w:top w:type="dxa" w:w="90"/>
@@ -4466,7 +5035,7 @@
               <w:bottom w:val="single" w:color="CCCCCC" w:sz="1"/>
               <w:right w:val="single" w:color="CCCCCC" w:sz="1"/>
             </w:tcBorders>
-            <w:shd w:fill="FFFFFF" w:val="clear"/>
+            <w:shd w:fill="EBF3FB" w:val="clear"/>
             <w:tcMar>
               <w:top w:type="dxa" w:w="90"/>
               <w:left w:type="dxa" w:w="130"/>
@@ -4488,7 +5057,7 @@
                 <w:sz w:val="19"/>
                 <w:szCs w:val="19"/>
               </w:rPr>
-              <w:t xml:space="preserve">Use hybrid rule-based + statistical approach as fallback</w:t>
+              <w:t xml:space="preserve">Enforce formal change request process against agreed scope</w:t>
             </w:r>
           </w:p>
         </w:tc>
@@ -4503,7 +5072,7 @@
               <w:bottom w:val="single" w:color="CCCCCC" w:sz="1"/>
               <w:right w:val="single" w:color="CCCCCC" w:sz="1"/>
             </w:tcBorders>
-            <w:shd w:fill="EBF3FB" w:val="clear"/>
+            <w:shd w:fill="FFFFFF" w:val="clear"/>
             <w:tcMar>
               <w:top w:type="dxa" w:w="90"/>
               <w:left w:type="dxa" w:w="130"/>
@@ -4525,42 +5094,7 @@
                 <w:sz w:val="19"/>
                 <w:szCs w:val="19"/>
               </w:rPr>
-              <w:t xml:space="preserve">Claude API rate limits during peak usage</w:t>
-            </w:r>
-          </w:p>
-        </w:tc>
-        <w:tc>
-          <w:tcPr>
-            <w:tcW w:type="dxa" w:w="1200"/>
-            <w:tcBorders>
-              <w:top w:val="single" w:color="CCCCCC" w:sz="1"/>
-              <w:left w:val="single" w:color="CCCCCC" w:sz="1"/>
-              <w:bottom w:val="single" w:color="CCCCCC" w:sz="1"/>
-              <w:right w:val="single" w:color="CCCCCC" w:sz="1"/>
-            </w:tcBorders>
-            <w:shd w:fill="E2EFDA" w:val="clear"/>
-            <w:tcMar>
-              <w:top w:type="dxa" w:w="90"/>
-              <w:left w:type="dxa" w:w="130"/>
-              <w:bottom w:type="dxa" w:w="90"/>
-              <w:right w:type="dxa" w:w="130"/>
-            </w:tcMar>
-            <w:vAlign w:val="center"/>
-          </w:tcPr>
-          <w:p>
-            <w:pPr>
-              <w:jc w:val="center"/>
-            </w:pPr>
-            <w:r>
-              <w:rPr>
-                <w:rFonts w:ascii="Calibri" w:cs="Calibri" w:eastAsia="Calibri" w:hAnsi="Calibri"/>
-                <w:b/>
-                <w:bCs/>
-                <w:color w:val="1E7145"/>
-                <w:sz w:val="19"/>
-                <w:szCs w:val="19"/>
-              </w:rPr>
-              <w:t xml:space="preserve">Low</w:t>
+              <w:t xml:space="preserve">UAT delays due to stakeholder availability</w:t>
             </w:r>
           </w:p>
         </w:tc>
@@ -4601,78 +5135,6 @@
         </w:tc>
         <w:tc>
           <w:tcPr>
-            <w:tcW w:type="dxa" w:w="4180"/>
-            <w:tcBorders>
-              <w:top w:val="single" w:color="CCCCCC" w:sz="1"/>
-              <w:left w:val="single" w:color="CCCCCC" w:sz="1"/>
-              <w:bottom w:val="single" w:color="CCCCCC" w:sz="1"/>
-              <w:right w:val="single" w:color="CCCCCC" w:sz="1"/>
-            </w:tcBorders>
-            <w:shd w:fill="EBF3FB" w:val="clear"/>
-            <w:tcMar>
-              <w:top w:type="dxa" w:w="90"/>
-              <w:left w:type="dxa" w:w="130"/>
-              <w:bottom w:type="dxa" w:w="90"/>
-              <w:right w:type="dxa" w:w="130"/>
-            </w:tcMar>
-            <w:vAlign w:val="center"/>
-          </w:tcPr>
-          <w:p>
-            <w:pPr>
-              <w:jc w:val="left"/>
-            </w:pPr>
-            <w:r>
-              <w:rPr>
-                <w:rFonts w:ascii="Calibri" w:cs="Calibri" w:eastAsia="Calibri" w:hAnsi="Calibri"/>
-                <w:b w:val="false"/>
-                <w:bCs w:val="false"/>
-                <w:color w:val="1A1A2E"/>
-                <w:sz w:val="19"/>
-                <w:szCs w:val="19"/>
-              </w:rPr>
-              <w:t xml:space="preserve">Implement request queuing and response caching</w:t>
-            </w:r>
-          </w:p>
-        </w:tc>
-      </w:tr>
-      <w:tr>
-        <w:tc>
-          <w:tcPr>
-            <w:tcW w:type="dxa" w:w="3500"/>
-            <w:tcBorders>
-              <w:top w:val="single" w:color="CCCCCC" w:sz="1"/>
-              <w:left w:val="single" w:color="CCCCCC" w:sz="1"/>
-              <w:bottom w:val="single" w:color="CCCCCC" w:sz="1"/>
-              <w:right w:val="single" w:color="CCCCCC" w:sz="1"/>
-            </w:tcBorders>
-            <w:shd w:fill="FFFFFF" w:val="clear"/>
-            <w:tcMar>
-              <w:top w:type="dxa" w:w="90"/>
-              <w:left w:type="dxa" w:w="130"/>
-              <w:bottom w:type="dxa" w:w="90"/>
-              <w:right w:type="dxa" w:w="130"/>
-            </w:tcMar>
-            <w:vAlign w:val="center"/>
-          </w:tcPr>
-          <w:p>
-            <w:pPr>
-              <w:jc w:val="left"/>
-            </w:pPr>
-            <w:r>
-              <w:rPr>
-                <w:rFonts w:ascii="Calibri" w:cs="Calibri" w:eastAsia="Calibri" w:hAnsi="Calibri"/>
-                <w:b w:val="false"/>
-                <w:bCs w:val="false"/>
-                <w:color w:val="1A1A2E"/>
-                <w:sz w:val="19"/>
-                <w:szCs w:val="19"/>
-              </w:rPr>
-              <w:t xml:space="preserve">Scope creep from additional stakeholder requests</w:t>
-            </w:r>
-          </w:p>
-        </w:tc>
-        <w:tc>
-          <w:tcPr>
             <w:tcW w:type="dxa" w:w="1200"/>
             <w:tcBorders>
               <w:top w:val="single" w:color="CCCCCC" w:sz="1"/>
@@ -4708,41 +5170,6 @@
         </w:tc>
         <w:tc>
           <w:tcPr>
-            <w:tcW w:type="dxa" w:w="1200"/>
-            <w:tcBorders>
-              <w:top w:val="single" w:color="CCCCCC" w:sz="1"/>
-              <w:left w:val="single" w:color="CCCCCC" w:sz="1"/>
-              <w:bottom w:val="single" w:color="CCCCCC" w:sz="1"/>
-              <w:right w:val="single" w:color="CCCCCC" w:sz="1"/>
-            </w:tcBorders>
-            <w:shd w:fill="FCE4D6" w:val="clear"/>
-            <w:tcMar>
-              <w:top w:type="dxa" w:w="90"/>
-              <w:left w:type="dxa" w:w="130"/>
-              <w:bottom w:type="dxa" w:w="90"/>
-              <w:right w:type="dxa" w:w="130"/>
-            </w:tcMar>
-            <w:vAlign w:val="center"/>
-          </w:tcPr>
-          <w:p>
-            <w:pPr>
-              <w:jc w:val="center"/>
-            </w:pPr>
-            <w:r>
-              <w:rPr>
-                <w:rFonts w:ascii="Calibri" w:cs="Calibri" w:eastAsia="Calibri" w:hAnsi="Calibri"/>
-                <w:b/>
-                <w:bCs/>
-                <w:color w:val="8B1A1A"/>
-                <w:sz w:val="19"/>
-                <w:szCs w:val="19"/>
-              </w:rPr>
-              <w:t xml:space="preserve">High</w:t>
-            </w:r>
-          </w:p>
-        </w:tc>
-        <w:tc>
-          <w:tcPr>
             <w:tcW w:type="dxa" w:w="4180"/>
             <w:tcBorders>
               <w:top w:val="single" w:color="CCCCCC" w:sz="1"/>
@@ -4772,291 +5199,7 @@
                 <w:sz w:val="19"/>
                 <w:szCs w:val="19"/>
               </w:rPr>
-              <w:t xml:space="preserve">Enforce formal change request process</w:t>
-            </w:r>
-          </w:p>
-        </w:tc>
-      </w:tr>
-      <w:tr>
-        <w:tc>
-          <w:tcPr>
-            <w:tcW w:type="dxa" w:w="3500"/>
-            <w:tcBorders>
-              <w:top w:val="single" w:color="CCCCCC" w:sz="1"/>
-              <w:left w:val="single" w:color="CCCCCC" w:sz="1"/>
-              <w:bottom w:val="single" w:color="CCCCCC" w:sz="1"/>
-              <w:right w:val="single" w:color="CCCCCC" w:sz="1"/>
-            </w:tcBorders>
-            <w:shd w:fill="EBF3FB" w:val="clear"/>
-            <w:tcMar>
-              <w:top w:type="dxa" w:w="90"/>
-              <w:left w:type="dxa" w:w="130"/>
-              <w:bottom w:type="dxa" w:w="90"/>
-              <w:right w:type="dxa" w:w="130"/>
-            </w:tcMar>
-            <w:vAlign w:val="center"/>
-          </w:tcPr>
-          <w:p>
-            <w:pPr>
-              <w:jc w:val="left"/>
-            </w:pPr>
-            <w:r>
-              <w:rPr>
-                <w:rFonts w:ascii="Calibri" w:cs="Calibri" w:eastAsia="Calibri" w:hAnsi="Calibri"/>
-                <w:b w:val="false"/>
-                <w:bCs w:val="false"/>
-                <w:color w:val="1A1A2E"/>
-                <w:sz w:val="19"/>
-                <w:szCs w:val="19"/>
-              </w:rPr>
-              <w:t xml:space="preserve">UAT delays due to stakeholder availability</w:t>
-            </w:r>
-          </w:p>
-        </w:tc>
-        <w:tc>
-          <w:tcPr>
-            <w:tcW w:type="dxa" w:w="1200"/>
-            <w:tcBorders>
-              <w:top w:val="single" w:color="CCCCCC" w:sz="1"/>
-              <w:left w:val="single" w:color="CCCCCC" w:sz="1"/>
-              <w:bottom w:val="single" w:color="CCCCCC" w:sz="1"/>
-              <w:right w:val="single" w:color="CCCCCC" w:sz="1"/>
-            </w:tcBorders>
-            <w:shd w:fill="FFF2CC" w:val="clear"/>
-            <w:tcMar>
-              <w:top w:type="dxa" w:w="90"/>
-              <w:left w:type="dxa" w:w="130"/>
-              <w:bottom w:type="dxa" w:w="90"/>
-              <w:right w:type="dxa" w:w="130"/>
-            </w:tcMar>
-            <w:vAlign w:val="center"/>
-          </w:tcPr>
-          <w:p>
-            <w:pPr>
-              <w:jc w:val="center"/>
-            </w:pPr>
-            <w:r>
-              <w:rPr>
-                <w:rFonts w:ascii="Calibri" w:cs="Calibri" w:eastAsia="Calibri" w:hAnsi="Calibri"/>
-                <w:b/>
-                <w:bCs/>
-                <w:color w:val="7B5E00"/>
-                <w:sz w:val="19"/>
-                <w:szCs w:val="19"/>
-              </w:rPr>
-              <w:t xml:space="preserve">Medium</w:t>
-            </w:r>
-          </w:p>
-        </w:tc>
-        <w:tc>
-          <w:tcPr>
-            <w:tcW w:type="dxa" w:w="1200"/>
-            <w:tcBorders>
-              <w:top w:val="single" w:color="CCCCCC" w:sz="1"/>
-              <w:left w:val="single" w:color="CCCCCC" w:sz="1"/>
-              <w:bottom w:val="single" w:color="CCCCCC" w:sz="1"/>
-              <w:right w:val="single" w:color="CCCCCC" w:sz="1"/>
-            </w:tcBorders>
-            <w:shd w:fill="FFF2CC" w:val="clear"/>
-            <w:tcMar>
-              <w:top w:type="dxa" w:w="90"/>
-              <w:left w:type="dxa" w:w="130"/>
-              <w:bottom w:type="dxa" w:w="90"/>
-              <w:right w:type="dxa" w:w="130"/>
-            </w:tcMar>
-            <w:vAlign w:val="center"/>
-          </w:tcPr>
-          <w:p>
-            <w:pPr>
-              <w:jc w:val="center"/>
-            </w:pPr>
-            <w:r>
-              <w:rPr>
-                <w:rFonts w:ascii="Calibri" w:cs="Calibri" w:eastAsia="Calibri" w:hAnsi="Calibri"/>
-                <w:b/>
-                <w:bCs/>
-                <w:color w:val="7B5E00"/>
-                <w:sz w:val="19"/>
-                <w:szCs w:val="19"/>
-              </w:rPr>
-              <w:t xml:space="preserve">Medium</w:t>
-            </w:r>
-          </w:p>
-        </w:tc>
-        <w:tc>
-          <w:tcPr>
-            <w:tcW w:type="dxa" w:w="4180"/>
-            <w:tcBorders>
-              <w:top w:val="single" w:color="CCCCCC" w:sz="1"/>
-              <w:left w:val="single" w:color="CCCCCC" w:sz="1"/>
-              <w:bottom w:val="single" w:color="CCCCCC" w:sz="1"/>
-              <w:right w:val="single" w:color="CCCCCC" w:sz="1"/>
-            </w:tcBorders>
-            <w:shd w:fill="EBF3FB" w:val="clear"/>
-            <w:tcMar>
-              <w:top w:type="dxa" w:w="90"/>
-              <w:left w:type="dxa" w:w="130"/>
-              <w:bottom w:type="dxa" w:w="90"/>
-              <w:right w:type="dxa" w:w="130"/>
-            </w:tcMar>
-            <w:vAlign w:val="center"/>
-          </w:tcPr>
-          <w:p>
-            <w:pPr>
-              <w:jc w:val="left"/>
-            </w:pPr>
-            <w:r>
-              <w:rPr>
-                <w:rFonts w:ascii="Calibri" w:cs="Calibri" w:eastAsia="Calibri" w:hAnsi="Calibri"/>
-                <w:b w:val="false"/>
-                <w:bCs w:val="false"/>
-                <w:color w:val="1A1A2E"/>
-                <w:sz w:val="19"/>
-                <w:szCs w:val="19"/>
-              </w:rPr>
-              <w:t xml:space="preserve">Schedule UAT sessions in advance; allow buffer weeks</w:t>
-            </w:r>
-          </w:p>
-        </w:tc>
-      </w:tr>
-      <w:tr>
-        <w:tc>
-          <w:tcPr>
-            <w:tcW w:type="dxa" w:w="3500"/>
-            <w:tcBorders>
-              <w:top w:val="single" w:color="CCCCCC" w:sz="1"/>
-              <w:left w:val="single" w:color="CCCCCC" w:sz="1"/>
-              <w:bottom w:val="single" w:color="CCCCCC" w:sz="1"/>
-              <w:right w:val="single" w:color="CCCCCC" w:sz="1"/>
-            </w:tcBorders>
-            <w:shd w:fill="FFFFFF" w:val="clear"/>
-            <w:tcMar>
-              <w:top w:type="dxa" w:w="90"/>
-              <w:left w:type="dxa" w:w="130"/>
-              <w:bottom w:type="dxa" w:w="90"/>
-              <w:right w:type="dxa" w:w="130"/>
-            </w:tcMar>
-            <w:vAlign w:val="center"/>
-          </w:tcPr>
-          <w:p>
-            <w:pPr>
-              <w:jc w:val="left"/>
-            </w:pPr>
-            <w:r>
-              <w:rPr>
-                <w:rFonts w:ascii="Calibri" w:cs="Calibri" w:eastAsia="Calibri" w:hAnsi="Calibri"/>
-                <w:b w:val="false"/>
-                <w:bCs w:val="false"/>
-                <w:color w:val="1A1A2E"/>
-                <w:sz w:val="19"/>
-                <w:szCs w:val="19"/>
-              </w:rPr>
-              <w:t xml:space="preserve">Performance degradation from AI API latency</w:t>
-            </w:r>
-          </w:p>
-        </w:tc>
-        <w:tc>
-          <w:tcPr>
-            <w:tcW w:type="dxa" w:w="1200"/>
-            <w:tcBorders>
-              <w:top w:val="single" w:color="CCCCCC" w:sz="1"/>
-              <w:left w:val="single" w:color="CCCCCC" w:sz="1"/>
-              <w:bottom w:val="single" w:color="CCCCCC" w:sz="1"/>
-              <w:right w:val="single" w:color="CCCCCC" w:sz="1"/>
-            </w:tcBorders>
-            <w:shd w:fill="E2EFDA" w:val="clear"/>
-            <w:tcMar>
-              <w:top w:type="dxa" w:w="90"/>
-              <w:left w:type="dxa" w:w="130"/>
-              <w:bottom w:type="dxa" w:w="90"/>
-              <w:right w:type="dxa" w:w="130"/>
-            </w:tcMar>
-            <w:vAlign w:val="center"/>
-          </w:tcPr>
-          <w:p>
-            <w:pPr>
-              <w:jc w:val="center"/>
-            </w:pPr>
-            <w:r>
-              <w:rPr>
-                <w:rFonts w:ascii="Calibri" w:cs="Calibri" w:eastAsia="Calibri" w:hAnsi="Calibri"/>
-                <w:b/>
-                <w:bCs/>
-                <w:color w:val="1E7145"/>
-                <w:sz w:val="19"/>
-                <w:szCs w:val="19"/>
-              </w:rPr>
-              <w:t xml:space="preserve">Low</w:t>
-            </w:r>
-          </w:p>
-        </w:tc>
-        <w:tc>
-          <w:tcPr>
-            <w:tcW w:type="dxa" w:w="1200"/>
-            <w:tcBorders>
-              <w:top w:val="single" w:color="CCCCCC" w:sz="1"/>
-              <w:left w:val="single" w:color="CCCCCC" w:sz="1"/>
-              <w:bottom w:val="single" w:color="CCCCCC" w:sz="1"/>
-              <w:right w:val="single" w:color="CCCCCC" w:sz="1"/>
-            </w:tcBorders>
-            <w:shd w:fill="FFF2CC" w:val="clear"/>
-            <w:tcMar>
-              <w:top w:type="dxa" w:w="90"/>
-              <w:left w:type="dxa" w:w="130"/>
-              <w:bottom w:type="dxa" w:w="90"/>
-              <w:right w:type="dxa" w:w="130"/>
-            </w:tcMar>
-            <w:vAlign w:val="center"/>
-          </w:tcPr>
-          <w:p>
-            <w:pPr>
-              <w:jc w:val="center"/>
-            </w:pPr>
-            <w:r>
-              <w:rPr>
-                <w:rFonts w:ascii="Calibri" w:cs="Calibri" w:eastAsia="Calibri" w:hAnsi="Calibri"/>
-                <w:b/>
-                <w:bCs/>
-                <w:color w:val="7B5E00"/>
-                <w:sz w:val="19"/>
-                <w:szCs w:val="19"/>
-              </w:rPr>
-              <w:t xml:space="preserve">Medium</w:t>
-            </w:r>
-          </w:p>
-        </w:tc>
-        <w:tc>
-          <w:tcPr>
-            <w:tcW w:type="dxa" w:w="4180"/>
-            <w:tcBorders>
-              <w:top w:val="single" w:color="CCCCCC" w:sz="1"/>
-              <w:left w:val="single" w:color="CCCCCC" w:sz="1"/>
-              <w:bottom w:val="single" w:color="CCCCCC" w:sz="1"/>
-              <w:right w:val="single" w:color="CCCCCC" w:sz="1"/>
-            </w:tcBorders>
-            <w:shd w:fill="FFFFFF" w:val="clear"/>
-            <w:tcMar>
-              <w:top w:type="dxa" w:w="90"/>
-              <w:left w:type="dxa" w:w="130"/>
-              <w:bottom w:type="dxa" w:w="90"/>
-              <w:right w:type="dxa" w:w="130"/>
-            </w:tcMar>
-            <w:vAlign w:val="center"/>
-          </w:tcPr>
-          <w:p>
-            <w:pPr>
-              <w:jc w:val="left"/>
-            </w:pPr>
-            <w:r>
-              <w:rPr>
-                <w:rFonts w:ascii="Calibri" w:cs="Calibri" w:eastAsia="Calibri" w:hAnsi="Calibri"/>
-                <w:b w:val="false"/>
-                <w:bCs w:val="false"/>
-                <w:color w:val="1A1A2E"/>
-                <w:sz w:val="19"/>
-                <w:szCs w:val="19"/>
-              </w:rPr>
-              <w:t xml:space="preserve">Async processing; loading states in UI; response caching</w:t>
+              <w:t xml:space="preserve">Schedule UAT sessions in advance; keep Phase 5 buffer</w:t>
             </w:r>
           </w:p>
         </w:tc>
@@ -5390,7 +5533,7 @@
                 <w:sz w:val="19"/>
                 <w:szCs w:val="19"/>
               </w:rPr>
-              <w:t xml:space="preserve">Client sign-off on Lead Scoring milestone</w:t>
+              <w:t xml:space="preserve">Sign-off on Sales Plan AI + User Access Report</w:t>
             </w:r>
           </w:p>
         </w:tc>
@@ -5496,7 +5639,7 @@
                 <w:sz w:val="19"/>
                 <w:szCs w:val="19"/>
               </w:rPr>
-              <w:t xml:space="preserve">Client sign-off on Quote &amp; Document AI milestone</w:t>
+              <w:t xml:space="preserve">Sign-off on Quote Options + Rates Lookup</w:t>
             </w:r>
           </w:p>
         </w:tc>
@@ -5531,7 +5674,7 @@
                 <w:sz w:val="19"/>
                 <w:szCs w:val="19"/>
               </w:rPr>
-              <w:t xml:space="preserve">LKR 130,000  (25%)</w:t>
+              <w:t xml:space="preserve">LKR 104,000  (20%)</w:t>
             </w:r>
           </w:p>
         </w:tc>
@@ -5602,7 +5745,7 @@
                 <w:sz w:val="19"/>
                 <w:szCs w:val="19"/>
               </w:rPr>
-              <w:t xml:space="preserve">Client sign-off on Forecasting &amp; Assistant milestone</w:t>
+              <w:t xml:space="preserve">Sign-off on Shipping Routes + Commodity Regulation</w:t>
             </w:r>
           </w:p>
         </w:tc>
@@ -5637,7 +5780,7 @@
                 <w:sz w:val="19"/>
                 <w:szCs w:val="19"/>
               </w:rPr>
-              <w:t xml:space="preserve">LKR 104,000  (20%)</w:t>
+              <w:t xml:space="preserve">LKR 130,000  (25%)</w:t>
             </w:r>
           </w:p>
         </w:tc>
@@ -5708,7 +5851,7 @@
                 <w:sz w:val="19"/>
                 <w:szCs w:val="19"/>
               </w:rPr>
-              <w:t xml:space="preserve">Production deployment and handover complete (Final Sign-Off)</w:t>
+              <w:t xml:space="preserve">Production deployment and handover (Final Sign-Off)</w:t>
             </w:r>
           </w:p>
         </w:tc>
@@ -6611,16 +6754,20 @@
               <w:bottom w:type="dxa" w:w="90"/>
               <w:right w:type="dxa" w:w="130"/>
             </w:tcMar>
-          </w:tcPr>
-          <w:p>
+            <w:vAlign w:val="center"/>
+          </w:tcPr>
+          <w:p>
+            <w:pPr>
+              <w:jc w:val="left"/>
+            </w:pPr>
             <w:r>
               <w:rPr>
                 <w:rFonts w:ascii="Calibri" w:cs="Calibri" w:eastAsia="Calibri" w:hAnsi="Calibri"/>
                 <w:b/>
                 <w:bCs/>
                 <w:color w:val="1F4E79"/>
-                <w:sz w:val="20"/>
-                <w:szCs w:val="20"/>
+                <w:sz w:val="19"/>
+                <w:szCs w:val="19"/>
               </w:rPr>
               <w:t xml:space="preserve">Client Representative</w:t>
             </w:r>
@@ -6642,13 +6789,20 @@
               <w:bottom w:type="dxa" w:w="90"/>
               <w:right w:type="dxa" w:w="130"/>
             </w:tcMar>
-          </w:tcPr>
-          <w:p>
-            <w:r>
-              <w:rPr>
-                <w:rFonts w:ascii="Calibri" w:cs="Calibri" w:eastAsia="Calibri" w:hAnsi="Calibri"/>
-                <w:sz w:val="20"/>
-                <w:szCs w:val="20"/>
+            <w:vAlign w:val="center"/>
+          </w:tcPr>
+          <w:p>
+            <w:pPr>
+              <w:jc w:val="left"/>
+            </w:pPr>
+            <w:r>
+              <w:rPr>
+                <w:rFonts w:ascii="Calibri" w:cs="Calibri" w:eastAsia="Calibri" w:hAnsi="Calibri"/>
+                <w:b w:val="false"/>
+                <w:bCs w:val="false"/>
+                <w:color w:val="1A1A2E"/>
+                <w:sz w:val="19"/>
+                <w:szCs w:val="19"/>
               </w:rPr>
               <w:t xml:space="preserve"/>
             </w:r>
@@ -6670,13 +6824,20 @@
               <w:bottom w:type="dxa" w:w="90"/>
               <w:right w:type="dxa" w:w="130"/>
             </w:tcMar>
-          </w:tcPr>
-          <w:p>
-            <w:r>
-              <w:rPr>
-                <w:rFonts w:ascii="Calibri" w:cs="Calibri" w:eastAsia="Calibri" w:hAnsi="Calibri"/>
-                <w:sz w:val="20"/>
-                <w:szCs w:val="20"/>
+            <w:vAlign w:val="center"/>
+          </w:tcPr>
+          <w:p>
+            <w:pPr>
+              <w:jc w:val="left"/>
+            </w:pPr>
+            <w:r>
+              <w:rPr>
+                <w:rFonts w:ascii="Calibri" w:cs="Calibri" w:eastAsia="Calibri" w:hAnsi="Calibri"/>
+                <w:b w:val="false"/>
+                <w:bCs w:val="false"/>
+                <w:color w:val="1A1A2E"/>
+                <w:sz w:val="19"/>
+                <w:szCs w:val="19"/>
               </w:rPr>
               <w:t xml:space="preserve"/>
             </w:r>
@@ -6698,13 +6859,20 @@
               <w:bottom w:type="dxa" w:w="90"/>
               <w:right w:type="dxa" w:w="130"/>
             </w:tcMar>
-          </w:tcPr>
-          <w:p>
-            <w:r>
-              <w:rPr>
-                <w:rFonts w:ascii="Calibri" w:cs="Calibri" w:eastAsia="Calibri" w:hAnsi="Calibri"/>
-                <w:sz w:val="20"/>
-                <w:szCs w:val="20"/>
+            <w:vAlign w:val="center"/>
+          </w:tcPr>
+          <w:p>
+            <w:pPr>
+              <w:jc w:val="left"/>
+            </w:pPr>
+            <w:r>
+              <w:rPr>
+                <w:rFonts w:ascii="Calibri" w:cs="Calibri" w:eastAsia="Calibri" w:hAnsi="Calibri"/>
+                <w:b w:val="false"/>
+                <w:bCs w:val="false"/>
+                <w:color w:val="1A1A2E"/>
+                <w:sz w:val="19"/>
+                <w:szCs w:val="19"/>
               </w:rPr>
               <w:t xml:space="preserve"/>
             </w:r>
@@ -6728,16 +6896,20 @@
               <w:bottom w:type="dxa" w:w="90"/>
               <w:right w:type="dxa" w:w="130"/>
             </w:tcMar>
-          </w:tcPr>
-          <w:p>
+            <w:vAlign w:val="center"/>
+          </w:tcPr>
+          <w:p>
+            <w:pPr>
+              <w:jc w:val="left"/>
+            </w:pPr>
             <w:r>
               <w:rPr>
                 <w:rFonts w:ascii="Calibri" w:cs="Calibri" w:eastAsia="Calibri" w:hAnsi="Calibri"/>
                 <w:b/>
                 <w:bCs/>
                 <w:color w:val="1F4E79"/>
-                <w:sz w:val="20"/>
-                <w:szCs w:val="20"/>
+                <w:sz w:val="19"/>
+                <w:szCs w:val="19"/>
               </w:rPr>
               <w:t xml:space="preserve">Project Lead</w:t>
             </w:r>
@@ -6759,13 +6931,20 @@
               <w:bottom w:type="dxa" w:w="90"/>
               <w:right w:type="dxa" w:w="130"/>
             </w:tcMar>
-          </w:tcPr>
-          <w:p>
-            <w:r>
-              <w:rPr>
-                <w:rFonts w:ascii="Calibri" w:cs="Calibri" w:eastAsia="Calibri" w:hAnsi="Calibri"/>
-                <w:sz w:val="20"/>
-                <w:szCs w:val="20"/>
+            <w:vAlign w:val="center"/>
+          </w:tcPr>
+          <w:p>
+            <w:pPr>
+              <w:jc w:val="left"/>
+            </w:pPr>
+            <w:r>
+              <w:rPr>
+                <w:rFonts w:ascii="Calibri" w:cs="Calibri" w:eastAsia="Calibri" w:hAnsi="Calibri"/>
+                <w:b w:val="false"/>
+                <w:bCs w:val="false"/>
+                <w:color w:val="1A1A2E"/>
+                <w:sz w:val="19"/>
+                <w:szCs w:val="19"/>
               </w:rPr>
               <w:t xml:space="preserve"/>
             </w:r>
@@ -6787,13 +6966,20 @@
               <w:bottom w:type="dxa" w:w="90"/>
               <w:right w:type="dxa" w:w="130"/>
             </w:tcMar>
-          </w:tcPr>
-          <w:p>
-            <w:r>
-              <w:rPr>
-                <w:rFonts w:ascii="Calibri" w:cs="Calibri" w:eastAsia="Calibri" w:hAnsi="Calibri"/>
-                <w:sz w:val="20"/>
-                <w:szCs w:val="20"/>
+            <w:vAlign w:val="center"/>
+          </w:tcPr>
+          <w:p>
+            <w:pPr>
+              <w:jc w:val="left"/>
+            </w:pPr>
+            <w:r>
+              <w:rPr>
+                <w:rFonts w:ascii="Calibri" w:cs="Calibri" w:eastAsia="Calibri" w:hAnsi="Calibri"/>
+                <w:b w:val="false"/>
+                <w:bCs w:val="false"/>
+                <w:color w:val="1A1A2E"/>
+                <w:sz w:val="19"/>
+                <w:szCs w:val="19"/>
               </w:rPr>
               <w:t xml:space="preserve"/>
             </w:r>
@@ -6815,13 +7001,20 @@
               <w:bottom w:type="dxa" w:w="90"/>
               <w:right w:type="dxa" w:w="130"/>
             </w:tcMar>
-          </w:tcPr>
-          <w:p>
-            <w:r>
-              <w:rPr>
-                <w:rFonts w:ascii="Calibri" w:cs="Calibri" w:eastAsia="Calibri" w:hAnsi="Calibri"/>
-                <w:sz w:val="20"/>
-                <w:szCs w:val="20"/>
+            <w:vAlign w:val="center"/>
+          </w:tcPr>
+          <w:p>
+            <w:pPr>
+              <w:jc w:val="left"/>
+            </w:pPr>
+            <w:r>
+              <w:rPr>
+                <w:rFonts w:ascii="Calibri" w:cs="Calibri" w:eastAsia="Calibri" w:hAnsi="Calibri"/>
+                <w:b w:val="false"/>
+                <w:bCs w:val="false"/>
+                <w:color w:val="1A1A2E"/>
+                <w:sz w:val="19"/>
+                <w:szCs w:val="19"/>
               </w:rPr>
               <w:t xml:space="preserve"/>
             </w:r>

</xml_diff>